<commit_message>
docs: document emotional memory summaries
</commit_message>
<xml_diff>
--- a/docs/照片记忆本产品需求文档_PRD_V2.docx
+++ b/docs/照片记忆本产品需求文档_PRD_V2.docx
@@ -40,6 +40,7 @@
       <w:tr>
         <w:trPr>
           <w:tblHeader w:val="true"/>
+          <w:cantSplit/>
         </w:trPr>
         <w:tc>
           <w:tcPr>
@@ -101,6 +102,9 @@
         </w:tc>
       </w:tr>
       <w:tr>
+        <w:trPr>
+          <w:cantSplit/>
+        </w:trPr>
         <w:tc>
           <w:tcPr>
             <w:tcW w:type="dxa" w:w="2232"/>
@@ -153,12 +157,15 @@
                 <w:color w:val="253C37"/>
                 <w:sz w:val="18"/>
               </w:rPr>
-              <w:t>V3.0</w:t>
+              <w:t>V4.0</w:t>
             </w:r>
           </w:p>
         </w:tc>
       </w:tr>
       <w:tr>
+        <w:trPr>
+          <w:cantSplit/>
+        </w:trPr>
         <w:tc>
           <w:tcPr>
             <w:tcW w:type="dxa" w:w="2232"/>
@@ -213,12 +220,15 @@
                 <w:color w:val="253C37"/>
                 <w:sz w:val="18"/>
               </w:rPr>
-              <w:t>2026年10月13日</w:t>
+              <w:t>2026年10月14日</w:t>
             </w:r>
           </w:p>
         </w:tc>
       </w:tr>
       <w:tr>
+        <w:trPr>
+          <w:cantSplit/>
+        </w:trPr>
         <w:tc>
           <w:tcPr>
             <w:tcW w:type="dxa" w:w="2232"/>
@@ -277,6 +287,9 @@
         </w:tc>
       </w:tr>
       <w:tr>
+        <w:trPr>
+          <w:cantSplit/>
+        </w:trPr>
         <w:tc>
           <w:tcPr>
             <w:tcW w:type="dxa" w:w="2232"/>
@@ -337,6 +350,9 @@
         </w:tc>
       </w:tr>
       <w:tr>
+        <w:trPr>
+          <w:cantSplit/>
+        </w:trPr>
         <w:tc>
           <w:tcPr>
             <w:tcW w:type="dxa" w:w="2232"/>
@@ -437,7 +453,7 @@
         <w:spacing w:after="240"/>
       </w:pPr>
       <w:r>
-        <w:t>本版覆盖当前网页 MVP 的全部功能、数据安全能力和业务边界。产品不依赖外部 AI，也不会把照片或文字上传到第三方；运行数据固定保存在 D 盘项目目录和本机 PostgreSQL。</w:t>
+        <w:t>本版覆盖当前网页 MVP 的全部功能、情绪电影、数据安全能力和业务边界。默认使用本地模板生成总结；只有用户主动开启云端 AI 后，后端才会发送授权范围内的最小结构化内容。运行数据固定保存在 D 盘项目目录和本机 PostgreSQL。</w:t>
       </w:r>
     </w:p>
     <w:p>
@@ -449,7 +465,7 @@
         <w:drawing>
           <wp:inline xmlns:a="http://schemas.openxmlformats.org/drawingml/2006/main" xmlns:pic="http://schemas.openxmlformats.org/drawingml/2006/picture">
             <wp:extent cx="6400800" cy="3602364"/>
-            <wp:docPr id="1" name="Picture 1" descr="Image: image1.png"/>
+            <wp:docPr id="1" name="Picture 1"/>
             <wp:cNvGraphicFramePr>
               <a:graphicFrameLocks noChangeAspect="1"/>
             </wp:cNvGraphicFramePr>
@@ -708,6 +724,7 @@
       <w:tr>
         <w:trPr>
           <w:tblHeader w:val="true"/>
+          <w:cantSplit/>
         </w:trPr>
         <w:tc>
           <w:tcPr>
@@ -798,6 +815,9 @@
         </w:tc>
       </w:tr>
       <w:tr>
+        <w:trPr>
+          <w:cantSplit/>
+        </w:trPr>
         <w:tc>
           <w:tcPr>
             <w:tcW w:type="dxa" w:w="1800"/>
@@ -884,6 +904,9 @@
         </w:tc>
       </w:tr>
       <w:tr>
+        <w:trPr>
+          <w:cantSplit/>
+        </w:trPr>
         <w:tc>
           <w:tcPr>
             <w:tcW w:type="dxa" w:w="1800"/>
@@ -973,6 +996,9 @@
         </w:tc>
       </w:tr>
       <w:tr>
+        <w:trPr>
+          <w:cantSplit/>
+        </w:trPr>
         <w:tc>
           <w:tcPr>
             <w:tcW w:type="dxa" w:w="1800"/>
@@ -1059,6 +1085,9 @@
         </w:tc>
       </w:tr>
       <w:tr>
+        <w:trPr>
+          <w:cantSplit/>
+        </w:trPr>
         <w:tc>
           <w:tcPr>
             <w:tcW w:type="dxa" w:w="1800"/>
@@ -1148,6 +1177,9 @@
         </w:tc>
       </w:tr>
       <w:tr>
+        <w:trPr>
+          <w:cantSplit/>
+        </w:trPr>
         <w:tc>
           <w:tcPr>
             <w:tcW w:type="dxa" w:w="1800"/>
@@ -1310,6 +1342,7 @@
       <w:tr>
         <w:trPr>
           <w:tblHeader w:val="true"/>
+          <w:cantSplit/>
         </w:trPr>
         <w:tc>
           <w:tcPr>
@@ -1400,6 +1433,9 @@
         </w:tc>
       </w:tr>
       <w:tr>
+        <w:trPr>
+          <w:cantSplit/>
+        </w:trPr>
         <w:tc>
           <w:tcPr>
             <w:tcW w:type="dxa" w:w="1872"/>
@@ -1486,6 +1522,9 @@
         </w:tc>
       </w:tr>
       <w:tr>
+        <w:trPr>
+          <w:cantSplit/>
+        </w:trPr>
         <w:tc>
           <w:tcPr>
             <w:tcW w:type="dxa" w:w="1872"/>
@@ -1575,6 +1614,9 @@
         </w:tc>
       </w:tr>
       <w:tr>
+        <w:trPr>
+          <w:cantSplit/>
+        </w:trPr>
         <w:tc>
           <w:tcPr>
             <w:tcW w:type="dxa" w:w="1872"/>
@@ -1661,6 +1703,9 @@
         </w:tc>
       </w:tr>
       <w:tr>
+        <w:trPr>
+          <w:cantSplit/>
+        </w:trPr>
         <w:tc>
           <w:tcPr>
             <w:tcW w:type="dxa" w:w="1872"/>
@@ -1750,6 +1795,9 @@
         </w:tc>
       </w:tr>
       <w:tr>
+        <w:trPr>
+          <w:cantSplit/>
+        </w:trPr>
         <w:tc>
           <w:tcPr>
             <w:tcW w:type="dxa" w:w="1872"/>
@@ -1830,12 +1878,15 @@
                 <w:color w:val="253C37"/>
                 <w:sz w:val="18"/>
               </w:rPr>
-              <w:t>生成确定性统计和代表记忆</w:t>
+              <w:t>生成第二人称情绪电影和代表记忆</w:t>
             </w:r>
           </w:p>
         </w:tc>
       </w:tr>
       <w:tr>
+        <w:trPr>
+          <w:cantSplit/>
+        </w:trPr>
         <w:tc>
           <w:tcPr>
             <w:tcW w:type="dxa" w:w="1872"/>
@@ -1953,6 +2004,7 @@
       <w:tr>
         <w:trPr>
           <w:tblHeader w:val="true"/>
+          <w:cantSplit/>
         </w:trPr>
         <w:tc>
           <w:tcPr>
@@ -2043,6 +2095,9 @@
         </w:tc>
       </w:tr>
       <w:tr>
+        <w:trPr>
+          <w:cantSplit/>
+        </w:trPr>
         <w:tc>
           <w:tcPr>
             <w:tcW w:type="dxa" w:w="2015"/>
@@ -2129,6 +2184,9 @@
         </w:tc>
       </w:tr>
       <w:tr>
+        <w:trPr>
+          <w:cantSplit/>
+        </w:trPr>
         <w:tc>
           <w:tcPr>
             <w:tcW w:type="dxa" w:w="2015"/>
@@ -2218,6 +2276,9 @@
         </w:tc>
       </w:tr>
       <w:tr>
+        <w:trPr>
+          <w:cantSplit/>
+        </w:trPr>
         <w:tc>
           <w:tcPr>
             <w:tcW w:type="dxa" w:w="2015"/>
@@ -2304,6 +2365,9 @@
         </w:tc>
       </w:tr>
       <w:tr>
+        <w:trPr>
+          <w:cantSplit/>
+        </w:trPr>
         <w:tc>
           <w:tcPr>
             <w:tcW w:type="dxa" w:w="2015"/>
@@ -2393,6 +2457,9 @@
         </w:tc>
       </w:tr>
       <w:tr>
+        <w:trPr>
+          <w:cantSplit/>
+        </w:trPr>
         <w:tc>
           <w:tcPr>
             <w:tcW w:type="dxa" w:w="2015"/>
@@ -2479,6 +2546,9 @@
         </w:tc>
       </w:tr>
       <w:tr>
+        <w:trPr>
+          <w:cantSplit/>
+        </w:trPr>
         <w:tc>
           <w:tcPr>
             <w:tcW w:type="dxa" w:w="2015"/>
@@ -2504,7 +2574,7 @@
                 <w:color w:val="253C37"/>
                 <w:sz w:val="18"/>
               </w:rPr>
-              <w:t>记忆总结</w:t>
+              <w:t>情绪电影</w:t>
             </w:r>
           </w:p>
         </w:tc>
@@ -2533,7 +2603,7 @@
                 <w:color w:val="253C37"/>
                 <w:sz w:val="18"/>
               </w:rPr>
-              <w:t>月度年度切换  排行  代表照片  副本进展</w:t>
+              <w:t>月度年度总结  沉浸播放  编辑  感言  档案馆</w:t>
             </w:r>
           </w:p>
         </w:tc>
@@ -2568,6 +2638,9 @@
         </w:tc>
       </w:tr>
       <w:tr>
+        <w:trPr>
+          <w:cantSplit/>
+        </w:trPr>
         <w:tc>
           <w:tcPr>
             <w:tcW w:type="dxa" w:w="2015"/>
@@ -2690,6 +2763,7 @@
       <w:tr>
         <w:trPr>
           <w:tblHeader w:val="true"/>
+          <w:cantSplit/>
         </w:trPr>
         <w:tc>
           <w:tcPr>
@@ -2780,6 +2854,9 @@
         </w:tc>
       </w:tr>
       <w:tr>
+        <w:trPr>
+          <w:cantSplit/>
+        </w:trPr>
         <w:tc>
           <w:tcPr>
             <w:tcW w:type="dxa" w:w="1944"/>
@@ -2866,6 +2943,9 @@
         </w:tc>
       </w:tr>
       <w:tr>
+        <w:trPr>
+          <w:cantSplit/>
+        </w:trPr>
         <w:tc>
           <w:tcPr>
             <w:tcW w:type="dxa" w:w="1944"/>
@@ -2955,6 +3035,9 @@
         </w:tc>
       </w:tr>
       <w:tr>
+        <w:trPr>
+          <w:cantSplit/>
+        </w:trPr>
         <w:tc>
           <w:tcPr>
             <w:tcW w:type="dxa" w:w="1944"/>
@@ -3041,6 +3124,9 @@
         </w:tc>
       </w:tr>
       <w:tr>
+        <w:trPr>
+          <w:cantSplit/>
+        </w:trPr>
         <w:tc>
           <w:tcPr>
             <w:tcW w:type="dxa" w:w="1944"/>
@@ -3130,6 +3216,9 @@
         </w:tc>
       </w:tr>
       <w:tr>
+        <w:trPr>
+          <w:cantSplit/>
+        </w:trPr>
         <w:tc>
           <w:tcPr>
             <w:tcW w:type="dxa" w:w="1944"/>
@@ -3216,6 +3305,9 @@
         </w:tc>
       </w:tr>
       <w:tr>
+        <w:trPr>
+          <w:cantSplit/>
+        </w:trPr>
         <w:tc>
           <w:tcPr>
             <w:tcW w:type="dxa" w:w="1944"/>
@@ -3305,6 +3397,9 @@
         </w:tc>
       </w:tr>
       <w:tr>
+        <w:trPr>
+          <w:cantSplit/>
+        </w:trPr>
         <w:tc>
           <w:tcPr>
             <w:tcW w:type="dxa" w:w="1944"/>
@@ -3544,6 +3639,7 @@
       <w:tr>
         <w:trPr>
           <w:tblHeader w:val="true"/>
+          <w:cantSplit/>
         </w:trPr>
         <w:tc>
           <w:tcPr>
@@ -3634,6 +3730,9 @@
         </w:tc>
       </w:tr>
       <w:tr>
+        <w:trPr>
+          <w:cantSplit/>
+        </w:trPr>
         <w:tc>
           <w:tcPr>
             <w:tcW w:type="dxa" w:w="2088"/>
@@ -3720,6 +3819,9 @@
         </w:tc>
       </w:tr>
       <w:tr>
+        <w:trPr>
+          <w:cantSplit/>
+        </w:trPr>
         <w:tc>
           <w:tcPr>
             <w:tcW w:type="dxa" w:w="2088"/>
@@ -3809,6 +3911,9 @@
         </w:tc>
       </w:tr>
       <w:tr>
+        <w:trPr>
+          <w:cantSplit/>
+        </w:trPr>
         <w:tc>
           <w:tcPr>
             <w:tcW w:type="dxa" w:w="2088"/>
@@ -3923,6 +4028,7 @@
       <w:tr>
         <w:trPr>
           <w:tblHeader w:val="true"/>
+          <w:cantSplit/>
         </w:trPr>
         <w:tc>
           <w:tcPr>
@@ -4013,6 +4119,9 @@
         </w:tc>
       </w:tr>
       <w:tr>
+        <w:trPr>
+          <w:cantSplit/>
+        </w:trPr>
         <w:tc>
           <w:tcPr>
             <w:tcW w:type="dxa" w:w="1728"/>
@@ -4099,6 +4208,9 @@
         </w:tc>
       </w:tr>
       <w:tr>
+        <w:trPr>
+          <w:cantSplit/>
+        </w:trPr>
         <w:tc>
           <w:tcPr>
             <w:tcW w:type="dxa" w:w="1728"/>
@@ -4188,6 +4300,9 @@
         </w:tc>
       </w:tr>
       <w:tr>
+        <w:trPr>
+          <w:cantSplit/>
+        </w:trPr>
         <w:tc>
           <w:tcPr>
             <w:tcW w:type="dxa" w:w="1728"/>
@@ -4274,6 +4389,9 @@
         </w:tc>
       </w:tr>
       <w:tr>
+        <w:trPr>
+          <w:cantSplit/>
+        </w:trPr>
         <w:tc>
           <w:tcPr>
             <w:tcW w:type="dxa" w:w="1728"/>
@@ -4396,6 +4514,7 @@
       <w:tr>
         <w:trPr>
           <w:tblHeader w:val="true"/>
+          <w:cantSplit/>
         </w:trPr>
         <w:tc>
           <w:tcPr>
@@ -4486,6 +4605,9 @@
         </w:tc>
       </w:tr>
       <w:tr>
+        <w:trPr>
+          <w:cantSplit/>
+        </w:trPr>
         <w:tc>
           <w:tcPr>
             <w:tcW w:type="dxa" w:w="2088"/>
@@ -4572,6 +4694,9 @@
         </w:tc>
       </w:tr>
       <w:tr>
+        <w:trPr>
+          <w:cantSplit/>
+        </w:trPr>
         <w:tc>
           <w:tcPr>
             <w:tcW w:type="dxa" w:w="2088"/>
@@ -4661,6 +4786,9 @@
         </w:tc>
       </w:tr>
       <w:tr>
+        <w:trPr>
+          <w:cantSplit/>
+        </w:trPr>
         <w:tc>
           <w:tcPr>
             <w:tcW w:type="dxa" w:w="2088"/>
@@ -4747,6 +4875,9 @@
         </w:tc>
       </w:tr>
       <w:tr>
+        <w:trPr>
+          <w:cantSplit/>
+        </w:trPr>
         <w:tc>
           <w:tcPr>
             <w:tcW w:type="dxa" w:w="2088"/>
@@ -4883,7 +5014,63 @@
     </w:p>
     <w:p>
       <w:r>
-        <w:t>总结模块从记忆首页进入，不增加底部导航。用户选择月份或年份后，系统按 Asia Shanghai 时区读取真实记录并生成统计结果。</w:t>
+        <w:t>月度与年度总结统一命名为“情绪电影”。它从首页提醒卡片和独立档案馆进入，以类似年度回顾的沉浸式翻页形式，用第二人称帮助用户回看自己经历过的阶段。</w:t>
+      </w:r>
+    </w:p>
+    <w:p>
+      <w:pPr>
+        <w:pStyle w:val="Heading2"/>
+      </w:pPr>
+      <w:r>
+        <w:t>7.1 生成与提醒</w:t>
+      </w:r>
+    </w:p>
+    <w:p>
+      <w:pPr>
+        <w:pStyle w:val="ListBullet"/>
+      </w:pPr>
+      <w:r>
+        <w:t>用户首次确认总结授权后，文字和照片默认参与；两者都可以单独关闭，云端 AI 默认关闭。</w:t>
+      </w:r>
+    </w:p>
+    <w:p>
+      <w:pPr>
+        <w:pStyle w:val="ListBullet"/>
+      </w:pPr>
+      <w:r>
+        <w:t>每月第一天起，用户当天首次打开首页时检查上个月；新年首次打开时同时检查上一年。</w:t>
+      </w:r>
+    </w:p>
+    <w:p>
+      <w:pPr>
+        <w:pStyle w:val="ListBullet"/>
+      </w:pPr>
+      <w:r>
+        <w:t>有真实记忆才创建总结；空周期不创建总结，也不显示虚构故事。</w:t>
+      </w:r>
+    </w:p>
+    <w:p>
+      <w:pPr>
+        <w:pStyle w:val="ListBullet"/>
+      </w:pPr>
+      <w:r>
+        <w:t>未读总结在首页显示“已经生成，可以前往查看”；关闭提醒不删除总结，之后仍可从档案馆进入。</w:t>
+      </w:r>
+    </w:p>
+    <w:p>
+      <w:pPr>
+        <w:pStyle w:val="ListBullet"/>
+      </w:pPr>
+      <w:r>
+        <w:t>生成结果保存在 PostgreSQL；阅读进度自动保存，再次打开从上次页面继续。</w:t>
+      </w:r>
+    </w:p>
+    <w:p>
+      <w:pPr>
+        <w:pStyle w:val="Heading2"/>
+      </w:pPr>
+      <w:r>
+        <w:t>7.2 故事结构</w:t>
       </w:r>
     </w:p>
     <w:tbl>
@@ -4901,10 +5088,11 @@
       <w:tr>
         <w:trPr>
           <w:tblHeader w:val="true"/>
+          <w:cantSplit/>
         </w:trPr>
         <w:tc>
           <w:tcPr>
-            <w:tcW w:type="dxa" w:w="2664"/>
+            <w:tcW w:type="dxa" w:w="1512"/>
             <w:shd w:fill="4F7E78"/>
             <w:vAlign w:val="center"/>
             <w:tcMar>
@@ -4927,13 +5115,13 @@
                 <w:color w:val="FFFFFF"/>
                 <w:sz w:val="18"/>
               </w:rPr>
-              <w:t>输出</w:t>
+              <w:t>类型</w:t>
             </w:r>
           </w:p>
         </w:tc>
         <w:tc>
           <w:tcPr>
-            <w:tcW w:type="dxa" w:w="4392"/>
+            <w:tcW w:type="dxa" w:w="5976"/>
             <w:shd w:fill="4F7E78"/>
             <w:vAlign w:val="center"/>
             <w:tcMar>
@@ -4956,13 +5144,13 @@
                 <w:color w:val="FFFFFF"/>
                 <w:sz w:val="18"/>
               </w:rPr>
-              <w:t>数据来源</w:t>
+              <w:t>正常结构</w:t>
             </w:r>
           </w:p>
         </w:tc>
         <w:tc>
           <w:tcPr>
-            <w:tcW w:type="dxa" w:w="2951"/>
+            <w:tcW w:type="dxa" w:w="2448"/>
             <w:shd w:fill="4F7E78"/>
             <w:vAlign w:val="center"/>
             <w:tcMar>
@@ -4985,15 +5173,18 @@
                 <w:color w:val="FFFFFF"/>
                 <w:sz w:val="18"/>
               </w:rPr>
-              <w:t>空数据处理</w:t>
+              <w:t>精简结构</w:t>
             </w:r>
           </w:p>
         </w:tc>
       </w:tr>
       <w:tr>
+        <w:trPr>
+          <w:cantSplit/>
+        </w:trPr>
         <w:tc>
           <w:tcPr>
-            <w:tcW w:type="dxa" w:w="2664"/>
+            <w:tcW w:type="dxa" w:w="1512"/>
             <w:vAlign w:val="center"/>
             <w:tcMar>
               <w:top w:w="110" w:type="dxa"/>
@@ -5015,13 +5206,13 @@
                 <w:color w:val="253C37"/>
                 <w:sz w:val="18"/>
               </w:rPr>
-              <w:t>记忆数 照片数 记录天数</w:t>
+              <w:t>月度</w:t>
             </w:r>
           </w:p>
         </w:tc>
         <w:tc>
           <w:tcPr>
-            <w:tcW w:type="dxa" w:w="4392"/>
+            <w:tcW w:type="dxa" w:w="5976"/>
             <w:vAlign w:val="center"/>
             <w:tcMar>
               <w:top w:w="110" w:type="dxa"/>
@@ -5043,13 +5234,13 @@
                 <w:color w:val="253C37"/>
                 <w:sz w:val="18"/>
               </w:rPr>
-              <w:t>所选周期内未删除记忆</w:t>
+              <w:t>7 页：封面、概览、情绪开场、代表记忆、长期副本、收束、感言</w:t>
             </w:r>
           </w:p>
         </w:tc>
         <w:tc>
           <w:tcPr>
-            <w:tcW w:type="dxa" w:w="2951"/>
+            <w:tcW w:type="dxa" w:w="2448"/>
             <w:vAlign w:val="center"/>
             <w:tcMar>
               <w:top w:w="110" w:type="dxa"/>
@@ -5071,15 +5262,18 @@
                 <w:color w:val="253C37"/>
                 <w:sz w:val="18"/>
               </w:rPr>
-              <w:t>显示零值和说明</w:t>
+              <w:t>仅 1 至 2 条记忆时生成 4 页</w:t>
             </w:r>
           </w:p>
         </w:tc>
       </w:tr>
       <w:tr>
+        <w:trPr>
+          <w:cantSplit/>
+        </w:trPr>
         <w:tc>
           <w:tcPr>
-            <w:tcW w:type="dxa" w:w="2664"/>
+            <w:tcW w:type="dxa" w:w="1512"/>
             <w:shd w:fill="EEF5F2"/>
             <w:vAlign w:val="center"/>
             <w:tcMar>
@@ -5102,13 +5296,13 @@
                 <w:color w:val="253C37"/>
                 <w:sz w:val="18"/>
               </w:rPr>
-              <w:t>主题 心情 状态排行</w:t>
+              <w:t>年度</w:t>
             </w:r>
           </w:p>
         </w:tc>
         <w:tc>
           <w:tcPr>
-            <w:tcW w:type="dxa" w:w="4392"/>
+            <w:tcW w:type="dxa" w:w="5976"/>
             <w:shd w:fill="EEF5F2"/>
             <w:vAlign w:val="center"/>
             <w:tcMar>
@@ -5131,13 +5325,13 @@
                 <w:color w:val="253C37"/>
                 <w:sz w:val="18"/>
               </w:rPr>
-              <w:t>主题关系 mood statuses</w:t>
+              <w:t>12 页：封面、概览、季节、长期副本、情绪、代表记忆、原话、日常、收束、感言</w:t>
             </w:r>
           </w:p>
         </w:tc>
         <w:tc>
           <w:tcPr>
-            <w:tcW w:type="dxa" w:w="2951"/>
+            <w:tcW w:type="dxa" w:w="2448"/>
             <w:shd w:fill="EEF5F2"/>
             <w:vAlign w:val="center"/>
             <w:tcMar>
@@ -5160,15 +5354,147 @@
                 <w:color w:val="253C37"/>
                 <w:sz w:val="18"/>
               </w:rPr>
-              <w:t>不展示空排行</w:t>
+              <w:t>仅 1 至 2 条记忆时生成 4 页</w:t>
+            </w:r>
+          </w:p>
+        </w:tc>
+      </w:tr>
+    </w:tbl>
+    <w:p>
+      <w:pPr>
+        <w:spacing w:after="40"/>
+      </w:pPr>
+    </w:p>
+    <w:p>
+      <w:pPr>
+        <w:pStyle w:val="ListBullet"/>
+      </w:pPr>
+      <w:r>
+        <w:t>情绪开场使用当期出现次数最多的心情；并列时优先最近出现的心情。</w:t>
+      </w:r>
+    </w:p>
+    <w:p>
+      <w:pPr>
+        <w:pStyle w:val="ListBullet"/>
+      </w:pPr>
+      <w:r>
+        <w:t>如果整期没有心情记录，系统从鼓励文案中稳定选择一句，并避免连续重复最近三次。</w:t>
+      </w:r>
+    </w:p>
+    <w:p>
+      <w:pPr>
+        <w:pStyle w:val="ListBullet"/>
+      </w:pPr>
+      <w:r>
+        <w:t>代表记忆优先选择标题、备忘录、状态和主题信息更完整的照片，并尽量分布在不同日期。</w:t>
+      </w:r>
+    </w:p>
+    <w:p>
+      <w:pPr>
+        <w:pStyle w:val="ListBullet"/>
+      </w:pPr>
+      <w:r>
+        <w:t>所有数字、主题、心情、状态、照片和原话必须来自冻结快照；不得补写用户没有记录的事实。</w:t>
+      </w:r>
+    </w:p>
+    <w:p>
+      <w:pPr>
+        <w:pStyle w:val="ListBullet"/>
+      </w:pPr>
+      <w:r>
+        <w:t>当前版本不加入背景音乐，也不加入双人共同空间或双人叙事。</w:t>
+      </w:r>
+    </w:p>
+    <w:p>
+      <w:pPr>
+        <w:pStyle w:val="Heading2"/>
+      </w:pPr>
+      <w:r>
+        <w:t>7.3 回看与编辑</w:t>
+      </w:r>
+    </w:p>
+    <w:tbl>
+      <w:tblPr>
+        <w:tblStyle w:val="TableGrid"/>
+        <w:tblW w:type="auto" w:w="0"/>
+        <w:jc w:val="center"/>
+        <w:tblLook w:firstColumn="1" w:firstRow="1" w:lastColumn="0" w:lastRow="0" w:noHBand="0" w:noVBand="1" w:val="04A0"/>
+      </w:tblPr>
+      <w:tblGrid>
+        <w:gridCol w:w="5083"/>
+        <w:gridCol w:w="5083"/>
+      </w:tblGrid>
+      <w:tr>
+        <w:trPr>
+          <w:tblHeader w:val="true"/>
+          <w:cantSplit/>
+        </w:trPr>
+        <w:tc>
+          <w:tcPr>
+            <w:tcW w:type="dxa" w:w="2088"/>
+            <w:shd w:fill="4F7E78"/>
+            <w:vAlign w:val="center"/>
+            <w:tcMar>
+              <w:top w:w="110" w:type="dxa"/>
+              <w:start w:w="120" w:type="dxa"/>
+              <w:bottom w:w="110" w:type="dxa"/>
+              <w:end w:w="120" w:type="dxa"/>
+            </w:tcMar>
+          </w:tcPr>
+          <w:p>
+            <w:pPr>
+              <w:spacing w:after="0" w:line="288" w:lineRule="auto"/>
+              <w:jc w:val="center"/>
+            </w:pPr>
+            <w:r/>
+            <w:r>
+              <w:rPr>
+                <w:rFonts w:ascii="Microsoft YaHei" w:hAnsi="Microsoft YaHei" w:eastAsia="Microsoft YaHei"/>
+                <w:b/>
+                <w:color w:val="FFFFFF"/>
+                <w:sz w:val="18"/>
+              </w:rPr>
+              <w:t>能力</w:t>
+            </w:r>
+          </w:p>
+        </w:tc>
+        <w:tc>
+          <w:tcPr>
+            <w:tcW w:type="dxa" w:w="7920"/>
+            <w:shd w:fill="4F7E78"/>
+            <w:vAlign w:val="center"/>
+            <w:tcMar>
+              <w:top w:w="110" w:type="dxa"/>
+              <w:start w:w="120" w:type="dxa"/>
+              <w:bottom w:w="110" w:type="dxa"/>
+              <w:end w:w="120" w:type="dxa"/>
+            </w:tcMar>
+          </w:tcPr>
+          <w:p>
+            <w:pPr>
+              <w:spacing w:after="0" w:line="288" w:lineRule="auto"/>
+              <w:jc w:val="center"/>
+            </w:pPr>
+            <w:r/>
+            <w:r>
+              <w:rPr>
+                <w:rFonts w:ascii="Microsoft YaHei" w:hAnsi="Microsoft YaHei" w:eastAsia="Microsoft YaHei"/>
+                <w:b/>
+                <w:color w:val="FFFFFF"/>
+                <w:sz w:val="18"/>
+              </w:rPr>
+              <w:t>业务规则</w:t>
             </w:r>
           </w:p>
         </w:tc>
       </w:tr>
       <w:tr>
+        <w:trPr>
+          <w:cantSplit/>
+        </w:trPr>
         <w:tc>
           <w:tcPr>
-            <w:tcW w:type="dxa" w:w="2664"/>
+            <w:tcW w:type="dxa" w:w="2088"/>
             <w:vAlign w:val="center"/>
             <w:tcMar>
               <w:top w:w="110" w:type="dxa"/>
@@ -5190,13 +5516,13 @@
                 <w:color w:val="253C37"/>
                 <w:sz w:val="18"/>
               </w:rPr>
-              <w:t>代表记忆</w:t>
+              <w:t>沉浸播放</w:t>
             </w:r>
           </w:p>
         </w:tc>
         <w:tc>
           <w:tcPr>
-            <w:tcW w:type="dxa" w:w="4392"/>
+            <w:tcW w:type="dxa" w:w="7920"/>
             <w:vAlign w:val="center"/>
             <w:tcMar>
               <w:top w:w="110" w:type="dxa"/>
@@ -5218,43 +5544,18 @@
                 <w:color w:val="253C37"/>
                 <w:sz w:val="18"/>
               </w:rPr>
-              <w:t>按确定性规则选择最多三条</w:t>
-            </w:r>
-          </w:p>
-        </w:tc>
-        <w:tc>
-          <w:tcPr>
-            <w:tcW w:type="dxa" w:w="2951"/>
-            <w:vAlign w:val="center"/>
-            <w:tcMar>
-              <w:top w:w="110" w:type="dxa"/>
-              <w:start w:w="120" w:type="dxa"/>
-              <w:bottom w:w="110" w:type="dxa"/>
-              <w:end w:w="120" w:type="dxa"/>
-            </w:tcMar>
-          </w:tcPr>
-          <w:p>
-            <w:pPr>
-              <w:spacing w:after="0" w:line="288" w:lineRule="auto"/>
-              <w:jc w:val="left"/>
-            </w:pPr>
-            <w:r/>
-            <w:r>
-              <w:rPr>
-                <w:rFonts w:ascii="Microsoft YaHei" w:hAnsi="Microsoft YaHei" w:eastAsia="Microsoft YaHei"/>
-                <w:b w:val="0"/>
-                <w:color w:val="253C37"/>
-                <w:sz w:val="18"/>
-              </w:rPr>
-              <w:t>不生成虚构文案</w:t>
+              <w:t>全屏逐页浏览，窄屏自适应；系统减少动态效果设置开启时关闭非必要动画</w:t>
             </w:r>
           </w:p>
         </w:tc>
       </w:tr>
       <w:tr>
+        <w:trPr>
+          <w:cantSplit/>
+        </w:trPr>
         <w:tc>
           <w:tcPr>
-            <w:tcW w:type="dxa" w:w="2664"/>
+            <w:tcW w:type="dxa" w:w="2088"/>
             <w:shd w:fill="EEF5F2"/>
             <w:vAlign w:val="center"/>
             <w:tcMar>
@@ -5277,13 +5578,13 @@
                 <w:color w:val="253C37"/>
                 <w:sz w:val="18"/>
               </w:rPr>
-              <w:t>长期副本进展</w:t>
+              <w:t>档案馆</w:t>
             </w:r>
           </w:p>
         </w:tc>
         <w:tc>
           <w:tcPr>
-            <w:tcW w:type="dxa" w:w="4392"/>
+            <w:tcW w:type="dxa" w:w="7920"/>
             <w:shd w:fill="EEF5F2"/>
             <w:vAlign w:val="center"/>
             <w:tcMar>
@@ -5306,13 +5607,108 @@
                 <w:color w:val="253C37"/>
                 <w:sz w:val="18"/>
               </w:rPr>
-              <w:t>副本状态和周期内关联记忆数</w:t>
+              <w:t>按月度或年度筛选，查看已生成、未读和已读总结，并可删除单份总结</w:t>
+            </w:r>
+          </w:p>
+        </w:tc>
+      </w:tr>
+      <w:tr>
+        <w:trPr>
+          <w:cantSplit/>
+        </w:trPr>
+        <w:tc>
+          <w:tcPr>
+            <w:tcW w:type="dxa" w:w="2088"/>
+            <w:vAlign w:val="center"/>
+            <w:tcMar>
+              <w:top w:w="110" w:type="dxa"/>
+              <w:start w:w="120" w:type="dxa"/>
+              <w:bottom w:w="110" w:type="dxa"/>
+              <w:end w:w="120" w:type="dxa"/>
+            </w:tcMar>
+          </w:tcPr>
+          <w:p>
+            <w:pPr>
+              <w:spacing w:after="0" w:line="288" w:lineRule="auto"/>
+              <w:jc w:val="center"/>
+            </w:pPr>
+            <w:r/>
+            <w:r>
+              <w:rPr>
+                <w:rFonts w:ascii="Microsoft YaHei" w:hAnsi="Microsoft YaHei" w:eastAsia="Microsoft YaHei"/>
+                <w:b w:val="0"/>
+                <w:color w:val="253C37"/>
+                <w:sz w:val="18"/>
+              </w:rPr>
+              <w:t>编辑</w:t>
             </w:r>
           </w:p>
         </w:tc>
         <w:tc>
           <w:tcPr>
-            <w:tcW w:type="dxa" w:w="2951"/>
+            <w:tcW w:type="dxa" w:w="7920"/>
+            <w:vAlign w:val="center"/>
+            <w:tcMar>
+              <w:top w:w="110" w:type="dxa"/>
+              <w:start w:w="120" w:type="dxa"/>
+              <w:bottom w:w="110" w:type="dxa"/>
+              <w:end w:w="120" w:type="dxa"/>
+            </w:tcMar>
+          </w:tcPr>
+          <w:p>
+            <w:pPr>
+              <w:spacing w:after="0" w:line="288" w:lineRule="auto"/>
+              <w:jc w:val="left"/>
+            </w:pPr>
+            <w:r/>
+            <w:r>
+              <w:rPr>
+                <w:rFonts w:ascii="Microsoft YaHei" w:hAnsi="Microsoft YaHei" w:eastAsia="Microsoft YaHei"/>
+                <w:b w:val="0"/>
+                <w:color w:val="253C37"/>
+                <w:sz w:val="18"/>
+              </w:rPr>
+              <w:t>可修改旁白、替换授权照片和调整页面顺序；乐观锁冲突时要求刷新，避免覆盖新版本</w:t>
+            </w:r>
+          </w:p>
+        </w:tc>
+      </w:tr>
+      <w:tr>
+        <w:trPr>
+          <w:cantSplit/>
+        </w:trPr>
+        <w:tc>
+          <w:tcPr>
+            <w:tcW w:type="dxa" w:w="2088"/>
+            <w:shd w:fill="EEF5F2"/>
+            <w:vAlign w:val="center"/>
+            <w:tcMar>
+              <w:top w:w="110" w:type="dxa"/>
+              <w:start w:w="120" w:type="dxa"/>
+              <w:bottom w:w="110" w:type="dxa"/>
+              <w:end w:w="120" w:type="dxa"/>
+            </w:tcMar>
+          </w:tcPr>
+          <w:p>
+            <w:pPr>
+              <w:spacing w:after="0" w:line="288" w:lineRule="auto"/>
+              <w:jc w:val="center"/>
+            </w:pPr>
+            <w:r/>
+            <w:r>
+              <w:rPr>
+                <w:rFonts w:ascii="Microsoft YaHei" w:hAnsi="Microsoft YaHei" w:eastAsia="Microsoft YaHei"/>
+                <w:b w:val="0"/>
+                <w:color w:val="253C37"/>
+                <w:sz w:val="18"/>
+              </w:rPr>
+              <w:t>重新生成</w:t>
+            </w:r>
+          </w:p>
+        </w:tc>
+        <w:tc>
+          <w:tcPr>
+            <w:tcW w:type="dxa" w:w="7920"/>
             <w:shd w:fill="EEF5F2"/>
             <w:vAlign w:val="center"/>
             <w:tcMar>
@@ -5335,7 +5731,68 @@
                 <w:color w:val="253C37"/>
                 <w:sz w:val="18"/>
               </w:rPr>
-              <w:t>没有副本时显示空态</w:t>
+              <w:t>重新读取当前记忆和授权设置，覆盖旧页面；空周期则移除旧总结</w:t>
+            </w:r>
+          </w:p>
+        </w:tc>
+      </w:tr>
+      <w:tr>
+        <w:trPr>
+          <w:cantSplit/>
+        </w:trPr>
+        <w:tc>
+          <w:tcPr>
+            <w:tcW w:type="dxa" w:w="2088"/>
+            <w:vAlign w:val="center"/>
+            <w:tcMar>
+              <w:top w:w="110" w:type="dxa"/>
+              <w:start w:w="120" w:type="dxa"/>
+              <w:bottom w:w="110" w:type="dxa"/>
+              <w:end w:w="120" w:type="dxa"/>
+            </w:tcMar>
+          </w:tcPr>
+          <w:p>
+            <w:pPr>
+              <w:spacing w:after="0" w:line="288" w:lineRule="auto"/>
+              <w:jc w:val="center"/>
+            </w:pPr>
+            <w:r/>
+            <w:r>
+              <w:rPr>
+                <w:rFonts w:ascii="Microsoft YaHei" w:hAnsi="Microsoft YaHei" w:eastAsia="Microsoft YaHei"/>
+                <w:b w:val="0"/>
+                <w:color w:val="253C37"/>
+                <w:sz w:val="18"/>
+              </w:rPr>
+              <w:t>回声感言</w:t>
+            </w:r>
+          </w:p>
+        </w:tc>
+        <w:tc>
+          <w:tcPr>
+            <w:tcW w:type="dxa" w:w="7920"/>
+            <w:vAlign w:val="center"/>
+            <w:tcMar>
+              <w:top w:w="110" w:type="dxa"/>
+              <w:start w:w="120" w:type="dxa"/>
+              <w:bottom w:w="110" w:type="dxa"/>
+              <w:end w:w="120" w:type="dxa"/>
+            </w:tcMar>
+          </w:tcPr>
+          <w:p>
+            <w:pPr>
+              <w:spacing w:after="0" w:line="288" w:lineRule="auto"/>
+              <w:jc w:val="left"/>
+            </w:pPr>
+            <w:r/>
+            <w:r>
+              <w:rPr>
+                <w:rFonts w:ascii="Microsoft YaHei" w:hAnsi="Microsoft YaHei" w:eastAsia="Microsoft YaHei"/>
+                <w:b w:val="0"/>
+                <w:color w:val="253C37"/>
+                <w:sz w:val="18"/>
+              </w:rPr>
+              <w:t>看完后可写一段总结感言并选择封面照片，作为独立记录保留</w:t>
             </w:r>
           </w:p>
         </w:tc>
@@ -5345,6 +5802,46 @@
       <w:pPr>
         <w:spacing w:after="40"/>
       </w:pPr>
+    </w:p>
+    <w:p>
+      <w:pPr>
+        <w:pStyle w:val="Heading2"/>
+      </w:pPr>
+      <w:r>
+        <w:t>7.4 AI 与隐私</w:t>
+      </w:r>
+    </w:p>
+    <w:p>
+      <w:pPr>
+        <w:pStyle w:val="ListBullet"/>
+      </w:pPr>
+      <w:r>
+        <w:t>本地模板始终可用；缺少 AI 配置、网络超时、接口失败或输出校验不通过时自动回退本地模板。</w:t>
+      </w:r>
+    </w:p>
+    <w:p>
+      <w:pPr>
+        <w:pStyle w:val="ListBullet"/>
+      </w:pPr>
+      <w:r>
+        <w:t>只有用户主动开启云端 AI，后端才发送授权范围内的最小结构化快照；本地路径、数据库连接和密钥永不发送。</w:t>
+      </w:r>
+    </w:p>
+    <w:p>
+      <w:pPr>
+        <w:pStyle w:val="ListBullet"/>
+      </w:pPr>
+      <w:r>
+        <w:t>AI 仅改写第二人称旁白。后端逐页校验页面数量、事实引用和数字，禁止引入快照外事实。</w:t>
+      </w:r>
+    </w:p>
+    <w:p>
+      <w:pPr>
+        <w:pStyle w:val="ListBullet"/>
+      </w:pPr>
+      <w:r>
+        <w:t>单条记忆可以设置“不参与总结”；软删除记忆和被排除记忆都不会进入新快照。</w:t>
+      </w:r>
     </w:p>
     <w:p>
       <w:pPr>
@@ -5377,6 +5874,7 @@
       <w:tr>
         <w:trPr>
           <w:tblHeader w:val="true"/>
+          <w:cantSplit/>
         </w:trPr>
         <w:tc>
           <w:tcPr>
@@ -5467,6 +5965,9 @@
         </w:tc>
       </w:tr>
       <w:tr>
+        <w:trPr>
+          <w:cantSplit/>
+        </w:trPr>
         <w:tc>
           <w:tcPr>
             <w:tcW w:type="dxa" w:w="2015"/>
@@ -5553,6 +6054,9 @@
         </w:tc>
       </w:tr>
       <w:tr>
+        <w:trPr>
+          <w:cantSplit/>
+        </w:trPr>
         <w:tc>
           <w:tcPr>
             <w:tcW w:type="dxa" w:w="2015"/>
@@ -5642,6 +6146,9 @@
         </w:tc>
       </w:tr>
       <w:tr>
+        <w:trPr>
+          <w:cantSplit/>
+        </w:trPr>
         <w:tc>
           <w:tcPr>
             <w:tcW w:type="dxa" w:w="2015"/>
@@ -5728,6 +6235,9 @@
         </w:tc>
       </w:tr>
       <w:tr>
+        <w:trPr>
+          <w:cantSplit/>
+        </w:trPr>
         <w:tc>
           <w:tcPr>
             <w:tcW w:type="dxa" w:w="2015"/>
@@ -5817,6 +6327,9 @@
         </w:tc>
       </w:tr>
       <w:tr>
+        <w:trPr>
+          <w:cantSplit/>
+        </w:trPr>
         <w:tc>
           <w:tcPr>
             <w:tcW w:type="dxa" w:w="2015"/>
@@ -5903,6 +6416,9 @@
         </w:tc>
       </w:tr>
       <w:tr>
+        <w:trPr>
+          <w:cantSplit/>
+        </w:trPr>
         <w:tc>
           <w:tcPr>
             <w:tcW w:type="dxa" w:w="2015"/>
@@ -6075,7 +6591,7 @@
         <w:drawing>
           <wp:inline xmlns:a="http://schemas.openxmlformats.org/drawingml/2006/main" xmlns:pic="http://schemas.openxmlformats.org/drawingml/2006/picture">
             <wp:extent cx="6400800" cy="4267733"/>
-            <wp:docPr id="2" name="Picture 2" descr="Image: image2.png"/>
+            <wp:docPr id="2" name="Picture 2"/>
             <wp:cNvGraphicFramePr>
               <a:graphicFrameLocks noChangeAspect="1"/>
             </wp:cNvGraphicFramePr>
@@ -6142,6 +6658,7 @@
       <w:tr>
         <w:trPr>
           <w:tblHeader w:val="true"/>
+          <w:cantSplit/>
         </w:trPr>
         <w:tc>
           <w:tcPr>
@@ -6203,6 +6720,9 @@
         </w:tc>
       </w:tr>
       <w:tr>
+        <w:trPr>
+          <w:cantSplit/>
+        </w:trPr>
         <w:tc>
           <w:tcPr>
             <w:tcW w:type="dxa" w:w="2880"/>
@@ -6261,6 +6781,9 @@
         </w:tc>
       </w:tr>
       <w:tr>
+        <w:trPr>
+          <w:cantSplit/>
+        </w:trPr>
         <w:tc>
           <w:tcPr>
             <w:tcW w:type="dxa" w:w="2880"/>
@@ -6321,6 +6844,9 @@
         </w:tc>
       </w:tr>
       <w:tr>
+        <w:trPr>
+          <w:cantSplit/>
+        </w:trPr>
         <w:tc>
           <w:tcPr>
             <w:tcW w:type="dxa" w:w="2880"/>
@@ -6379,6 +6905,9 @@
         </w:tc>
       </w:tr>
       <w:tr>
+        <w:trPr>
+          <w:cantSplit/>
+        </w:trPr>
         <w:tc>
           <w:tcPr>
             <w:tcW w:type="dxa" w:w="2880"/>
@@ -6439,6 +6968,9 @@
         </w:tc>
       </w:tr>
       <w:tr>
+        <w:trPr>
+          <w:cantSplit/>
+        </w:trPr>
         <w:tc>
           <w:tcPr>
             <w:tcW w:type="dxa" w:w="2880"/>
@@ -6497,6 +7029,9 @@
         </w:tc>
       </w:tr>
       <w:tr>
+        <w:trPr>
+          <w:cantSplit/>
+        </w:trPr>
         <w:tc>
           <w:tcPr>
             <w:tcW w:type="dxa" w:w="2880"/>
@@ -6557,6 +7092,9 @@
         </w:tc>
       </w:tr>
       <w:tr>
+        <w:trPr>
+          <w:cantSplit/>
+        </w:trPr>
         <w:tc>
           <w:tcPr>
             <w:tcW w:type="dxa" w:w="2880"/>
@@ -6615,6 +7153,9 @@
         </w:tc>
       </w:tr>
       <w:tr>
+        <w:trPr>
+          <w:cantSplit/>
+        </w:trPr>
         <w:tc>
           <w:tcPr>
             <w:tcW w:type="dxa" w:w="2880"/>
@@ -6674,6 +7215,130 @@
           </w:p>
         </w:tc>
       </w:tr>
+      <w:tr>
+        <w:trPr>
+          <w:cantSplit/>
+        </w:trPr>
+        <w:tc>
+          <w:tcPr>
+            <w:tcW w:type="dxa" w:w="2880"/>
+            <w:vAlign w:val="center"/>
+            <w:tcMar>
+              <w:top w:w="110" w:type="dxa"/>
+              <w:start w:w="120" w:type="dxa"/>
+              <w:bottom w:w="110" w:type="dxa"/>
+              <w:end w:w="120" w:type="dxa"/>
+            </w:tcMar>
+          </w:tcPr>
+          <w:p>
+            <w:pPr>
+              <w:spacing w:after="0" w:line="288" w:lineRule="auto"/>
+              <w:jc w:val="center"/>
+            </w:pPr>
+            <w:r/>
+            <w:r>
+              <w:rPr>
+                <w:rFonts w:ascii="Microsoft YaHei" w:hAnsi="Microsoft YaHei" w:eastAsia="Microsoft YaHei"/>
+                <w:b w:val="0"/>
+                <w:color w:val="253C37"/>
+                <w:sz w:val="18"/>
+              </w:rPr>
+              <w:t>云端 AI 不可用</w:t>
+            </w:r>
+          </w:p>
+        </w:tc>
+        <w:tc>
+          <w:tcPr>
+            <w:tcW w:type="dxa" w:w="7128"/>
+            <w:vAlign w:val="center"/>
+            <w:tcMar>
+              <w:top w:w="110" w:type="dxa"/>
+              <w:start w:w="120" w:type="dxa"/>
+              <w:bottom w:w="110" w:type="dxa"/>
+              <w:end w:w="120" w:type="dxa"/>
+            </w:tcMar>
+          </w:tcPr>
+          <w:p>
+            <w:pPr>
+              <w:spacing w:after="0" w:line="288" w:lineRule="auto"/>
+              <w:jc w:val="left"/>
+            </w:pPr>
+            <w:r/>
+            <w:r>
+              <w:rPr>
+                <w:rFonts w:ascii="Microsoft YaHei" w:hAnsi="Microsoft YaHei" w:eastAsia="Microsoft YaHei"/>
+                <w:b w:val="0"/>
+                <w:color w:val="253C37"/>
+                <w:sz w:val="18"/>
+              </w:rPr>
+              <w:t>不阻断总结生成，校验失败或请求异常时立即使用本地模板</w:t>
+            </w:r>
+          </w:p>
+        </w:tc>
+      </w:tr>
+      <w:tr>
+        <w:trPr>
+          <w:cantSplit/>
+        </w:trPr>
+        <w:tc>
+          <w:tcPr>
+            <w:tcW w:type="dxa" w:w="2880"/>
+            <w:shd w:fill="EEF5F2"/>
+            <w:vAlign w:val="center"/>
+            <w:tcMar>
+              <w:top w:w="110" w:type="dxa"/>
+              <w:start w:w="120" w:type="dxa"/>
+              <w:bottom w:w="110" w:type="dxa"/>
+              <w:end w:w="120" w:type="dxa"/>
+            </w:tcMar>
+          </w:tcPr>
+          <w:p>
+            <w:pPr>
+              <w:spacing w:after="0" w:line="288" w:lineRule="auto"/>
+              <w:jc w:val="center"/>
+            </w:pPr>
+            <w:r/>
+            <w:r>
+              <w:rPr>
+                <w:rFonts w:ascii="Microsoft YaHei" w:hAnsi="Microsoft YaHei" w:eastAsia="Microsoft YaHei"/>
+                <w:b w:val="0"/>
+                <w:color w:val="253C37"/>
+                <w:sz w:val="18"/>
+              </w:rPr>
+              <w:t>总结版本冲突</w:t>
+            </w:r>
+          </w:p>
+        </w:tc>
+        <w:tc>
+          <w:tcPr>
+            <w:tcW w:type="dxa" w:w="7128"/>
+            <w:shd w:fill="EEF5F2"/>
+            <w:vAlign w:val="center"/>
+            <w:tcMar>
+              <w:top w:w="110" w:type="dxa"/>
+              <w:start w:w="120" w:type="dxa"/>
+              <w:bottom w:w="110" w:type="dxa"/>
+              <w:end w:w="120" w:type="dxa"/>
+            </w:tcMar>
+          </w:tcPr>
+          <w:p>
+            <w:pPr>
+              <w:spacing w:after="0" w:line="288" w:lineRule="auto"/>
+              <w:jc w:val="left"/>
+            </w:pPr>
+            <w:r/>
+            <w:r>
+              <w:rPr>
+                <w:rFonts w:ascii="Microsoft YaHei" w:hAnsi="Microsoft YaHei" w:eastAsia="Microsoft YaHei"/>
+                <w:b w:val="0"/>
+                <w:color w:val="253C37"/>
+                <w:sz w:val="18"/>
+              </w:rPr>
+              <w:t>返回 409，前端提示刷新，禁止旧版本覆盖较新的旁白或页面顺序</w:t>
+            </w:r>
+          </w:p>
+        </w:tc>
+      </w:tr>
     </w:tbl>
     <w:p>
       <w:pPr>
@@ -6702,6 +7367,7 @@
       <w:tr>
         <w:trPr>
           <w:tblHeader w:val="true"/>
+          <w:cantSplit/>
         </w:trPr>
         <w:tc>
           <w:tcPr>
@@ -6763,6 +7429,9 @@
         </w:tc>
       </w:tr>
       <w:tr>
+        <w:trPr>
+          <w:cantSplit/>
+        </w:trPr>
         <w:tc>
           <w:tcPr>
             <w:tcW w:type="dxa" w:w="1944"/>
@@ -6815,12 +7484,15 @@
                 <w:color w:val="253C37"/>
                 <w:sz w:val="18"/>
               </w:rPr>
-              <w:t>不上传第三方；不记录明文密码；数据库连接信息仅返回脱敏用户名</w:t>
+              <w:t>默认本地模板；仅经授权向云端 AI 发送最小快照；不记录明文密码；数据库连接信息仅返回脱敏用户名</w:t>
             </w:r>
           </w:p>
         </w:tc>
       </w:tr>
       <w:tr>
+        <w:trPr>
+          <w:cantSplit/>
+        </w:trPr>
         <w:tc>
           <w:tcPr>
             <w:tcW w:type="dxa" w:w="1944"/>
@@ -6881,6 +7553,9 @@
         </w:tc>
       </w:tr>
       <w:tr>
+        <w:trPr>
+          <w:cantSplit/>
+        </w:trPr>
         <w:tc>
           <w:tcPr>
             <w:tcW w:type="dxa" w:w="1944"/>
@@ -6939,6 +7614,9 @@
         </w:tc>
       </w:tr>
       <w:tr>
+        <w:trPr>
+          <w:cantSplit/>
+        </w:trPr>
         <w:tc>
           <w:tcPr>
             <w:tcW w:type="dxa" w:w="1944"/>
@@ -6999,6 +7677,9 @@
         </w:tc>
       </w:tr>
       <w:tr>
+        <w:trPr>
+          <w:cantSplit/>
+        </w:trPr>
         <w:tc>
           <w:tcPr>
             <w:tcW w:type="dxa" w:w="1944"/>
@@ -7057,6 +7738,9 @@
         </w:tc>
       </w:tr>
       <w:tr>
+        <w:trPr>
+          <w:cantSplit/>
+        </w:trPr>
         <w:tc>
           <w:tcPr>
             <w:tcW w:type="dxa" w:w="1944"/>
@@ -7117,6 +7801,9 @@
         </w:tc>
       </w:tr>
       <w:tr>
+        <w:trPr>
+          <w:cantSplit/>
+        </w:trPr>
         <w:tc>
           <w:tcPr>
             <w:tcW w:type="dxa" w:w="1944"/>
@@ -7208,6 +7895,7 @@
       <w:tr>
         <w:trPr>
           <w:tblHeader w:val="true"/>
+          <w:cantSplit/>
         </w:trPr>
         <w:tc>
           <w:tcPr>
@@ -7298,6 +7986,9 @@
         </w:tc>
       </w:tr>
       <w:tr>
+        <w:trPr>
+          <w:cantSplit/>
+        </w:trPr>
         <w:tc>
           <w:tcPr>
             <w:tcW w:type="dxa" w:w="1007"/>
@@ -7384,6 +8075,9 @@
         </w:tc>
       </w:tr>
       <w:tr>
+        <w:trPr>
+          <w:cantSplit/>
+        </w:trPr>
         <w:tc>
           <w:tcPr>
             <w:tcW w:type="dxa" w:w="1007"/>
@@ -7473,6 +8167,9 @@
         </w:tc>
       </w:tr>
       <w:tr>
+        <w:trPr>
+          <w:cantSplit/>
+        </w:trPr>
         <w:tc>
           <w:tcPr>
             <w:tcW w:type="dxa" w:w="1007"/>
@@ -7559,6 +8256,9 @@
         </w:tc>
       </w:tr>
       <w:tr>
+        <w:trPr>
+          <w:cantSplit/>
+        </w:trPr>
         <w:tc>
           <w:tcPr>
             <w:tcW w:type="dxa" w:w="1007"/>
@@ -7613,7 +8313,7 @@
                 <w:color w:val="253C37"/>
                 <w:sz w:val="18"/>
               </w:rPr>
-              <w:t>月度和年度总结使用真实数据并处理空周期</w:t>
+              <w:t>月度和年度情绪电影使用真实快照，支持提醒、播放、进度、编辑、再生成和感言</w:t>
             </w:r>
           </w:p>
         </w:tc>
@@ -7642,12 +8342,15 @@
                 <w:color w:val="253C37"/>
                 <w:sz w:val="18"/>
               </w:rPr>
-              <w:t>已实现</w:t>
+              <w:t>已实现并自动测试</w:t>
             </w:r>
           </w:p>
         </w:tc>
       </w:tr>
       <w:tr>
+        <w:trPr>
+          <w:cantSplit/>
+        </w:trPr>
         <w:tc>
           <w:tcPr>
             <w:tcW w:type="dxa" w:w="1007"/>
@@ -7734,6 +8437,9 @@
         </w:tc>
       </w:tr>
       <w:tr>
+        <w:trPr>
+          <w:cantSplit/>
+        </w:trPr>
         <w:tc>
           <w:tcPr>
             <w:tcW w:type="dxa" w:w="1007"/>
@@ -7823,6 +8529,9 @@
         </w:tc>
       </w:tr>
       <w:tr>
+        <w:trPr>
+          <w:cantSplit/>
+        </w:trPr>
         <w:tc>
           <w:tcPr>
             <w:tcW w:type="dxa" w:w="1007"/>
@@ -7909,6 +8618,9 @@
         </w:tc>
       </w:tr>
       <w:tr>
+        <w:trPr>
+          <w:cantSplit/>
+        </w:trPr>
         <w:tc>
           <w:tcPr>
             <w:tcW w:type="dxa" w:w="1007"/>
@@ -7998,6 +8710,9 @@
         </w:tc>
       </w:tr>
       <w:tr>
+        <w:trPr>
+          <w:cantSplit/>
+        </w:trPr>
         <w:tc>
           <w:tcPr>
             <w:tcW w:type="dxa" w:w="1007"/>
@@ -8091,7 +8806,7 @@
     </w:p>
     <w:p>
       <w:r>
-        <w:t>本次发布前验证结果为前端 28 个测试文件共 68 项通过，后端 23 个测试文件共 90 项通过；前后端生产构建通过，Prisma schema 有效，5 个数据库迁移全部应用。</w:t>
+        <w:t>本次发布前验证基线为前端 38 个测试文件共 100 项通过，后端 33 个测试文件共 136 项通过；前后端生产构建通过，Prisma schema 有效，6 个数据库迁移全部应用。最终交付前会再次执行全量验证。</w:t>
       </w:r>
     </w:p>
     <w:p>
@@ -8123,7 +8838,15 @@
         <w:pStyle w:val="ListBullet"/>
       </w:pPr>
       <w:r>
-        <w:t>总结使用确定性统计，不调用大模型自动创作文案。</w:t>
+        <w:t>总结默认使用确定性统计和本地模板；云端 AI 只在用户授权且服务端完成配置时用于改写旁白。</w:t>
+      </w:r>
+    </w:p>
+    <w:p>
+      <w:pPr>
+        <w:pStyle w:val="ListBullet"/>
+      </w:pPr>
+      <w:r>
+        <w:t>当前不提供背景音乐，不提供双人共同空间、双人年度回顾或共同编辑。</w:t>
       </w:r>
     </w:p>
     <w:p>

</xml_diff>

<commit_message>
docs: align full product visuals with emotional summaries
</commit_message>
<xml_diff>
--- a/docs/照片记忆本产品需求文档_PRD_V2.docx
+++ b/docs/照片记忆本产品需求文档_PRD_V2.docx
@@ -32,6 +32,14 @@
         <w:tblW w:type="auto" w:w="0"/>
         <w:jc w:val="center"/>
         <w:tblLook w:firstColumn="1" w:firstRow="1" w:lastColumn="0" w:lastRow="0" w:noHBand="0" w:noVBand="1" w:val="04A0"/>
+        <w:tblBorders>
+          <w:top w:val="single" w:sz="4" w:color="D9D9D9"/>
+          <w:left w:val="single" w:sz="4" w:color="D9D9D9"/>
+          <w:bottom w:val="single" w:sz="4" w:color="D9D9D9"/>
+          <w:right w:val="single" w:sz="4" w:color="D9D9D9"/>
+          <w:insideH w:val="single" w:sz="4" w:color="D9D9D9"/>
+          <w:insideV w:val="single" w:sz="4" w:color="D9D9D9"/>
+        </w:tblBorders>
       </w:tblPr>
       <w:tblGrid>
         <w:gridCol w:w="5083"/>
@@ -157,7 +165,7 @@
                 <w:color w:val="253C37"/>
                 <w:sz w:val="18"/>
               </w:rPr>
-              <w:t>V4.0</w:t>
+              <w:t>V4.1</w:t>
             </w:r>
           </w:p>
         </w:tc>
@@ -464,8 +472,8 @@
       <w:r>
         <w:drawing>
           <wp:inline xmlns:a="http://schemas.openxmlformats.org/drawingml/2006/main" xmlns:pic="http://schemas.openxmlformats.org/drawingml/2006/picture">
-            <wp:extent cx="6400800" cy="3602364"/>
-            <wp:docPr id="1" name="Picture 1"/>
+            <wp:extent cx="6400800" cy="4838700"/>
+            <wp:docPr id="1" name="Picture 1" descr="产品功能总览示意图"/>
             <wp:cNvGraphicFramePr>
               <a:graphicFrameLocks noChangeAspect="1"/>
             </wp:cNvGraphicFramePr>
@@ -485,7 +493,7 @@
                   <pic:spPr>
                     <a:xfrm>
                       <a:off x="0" y="0"/>
-                      <a:ext cx="6400800" cy="3602364"/>
+                      <a:ext cx="6400800" cy="4838700"/>
                     </a:xfrm>
                     <a:prstGeom prst="rect"/>
                   </pic:spPr>
@@ -715,6 +723,14 @@
         <w:tblW w:type="auto" w:w="0"/>
         <w:jc w:val="center"/>
         <w:tblLook w:firstColumn="1" w:firstRow="1" w:lastColumn="0" w:lastRow="0" w:noHBand="0" w:noVBand="1" w:val="04A0"/>
+        <w:tblBorders>
+          <w:top w:val="single" w:sz="4" w:color="D9D9D9"/>
+          <w:left w:val="single" w:sz="4" w:color="D9D9D9"/>
+          <w:bottom w:val="single" w:sz="4" w:color="D9D9D9"/>
+          <w:right w:val="single" w:sz="4" w:color="D9D9D9"/>
+          <w:insideH w:val="single" w:sz="4" w:color="D9D9D9"/>
+          <w:insideV w:val="single" w:sz="4" w:color="D9D9D9"/>
+        </w:tblBorders>
       </w:tblPr>
       <w:tblGrid>
         <w:gridCol w:w="3389"/>
@@ -1333,6 +1349,14 @@
         <w:tblW w:type="auto" w:w="0"/>
         <w:jc w:val="center"/>
         <w:tblLook w:firstColumn="1" w:firstRow="1" w:lastColumn="0" w:lastRow="0" w:noHBand="0" w:noVBand="1" w:val="04A0"/>
+        <w:tblBorders>
+          <w:top w:val="single" w:sz="4" w:color="D9D9D9"/>
+          <w:left w:val="single" w:sz="4" w:color="D9D9D9"/>
+          <w:bottom w:val="single" w:sz="4" w:color="D9D9D9"/>
+          <w:right w:val="single" w:sz="4" w:color="D9D9D9"/>
+          <w:insideH w:val="single" w:sz="4" w:color="D9D9D9"/>
+          <w:insideV w:val="single" w:sz="4" w:color="D9D9D9"/>
+        </w:tblBorders>
       </w:tblPr>
       <w:tblGrid>
         <w:gridCol w:w="3389"/>
@@ -1995,6 +2019,14 @@
         <w:tblW w:type="auto" w:w="0"/>
         <w:jc w:val="center"/>
         <w:tblLook w:firstColumn="1" w:firstRow="1" w:lastColumn="0" w:lastRow="0" w:noHBand="0" w:noVBand="1" w:val="04A0"/>
+        <w:tblBorders>
+          <w:top w:val="single" w:sz="4" w:color="D9D9D9"/>
+          <w:left w:val="single" w:sz="4" w:color="D9D9D9"/>
+          <w:bottom w:val="single" w:sz="4" w:color="D9D9D9"/>
+          <w:right w:val="single" w:sz="4" w:color="D9D9D9"/>
+          <w:insideH w:val="single" w:sz="4" w:color="D9D9D9"/>
+          <w:insideV w:val="single" w:sz="4" w:color="D9D9D9"/>
+        </w:tblBorders>
       </w:tblPr>
       <w:tblGrid>
         <w:gridCol w:w="3389"/>
@@ -2754,6 +2786,14 @@
         <w:tblW w:type="auto" w:w="0"/>
         <w:jc w:val="center"/>
         <w:tblLook w:firstColumn="1" w:firstRow="1" w:lastColumn="0" w:lastRow="0" w:noHBand="0" w:noVBand="1" w:val="04A0"/>
+        <w:tblBorders>
+          <w:top w:val="single" w:sz="4" w:color="D9D9D9"/>
+          <w:left w:val="single" w:sz="4" w:color="D9D9D9"/>
+          <w:bottom w:val="single" w:sz="4" w:color="D9D9D9"/>
+          <w:right w:val="single" w:sz="4" w:color="D9D9D9"/>
+          <w:insideH w:val="single" w:sz="4" w:color="D9D9D9"/>
+          <w:insideV w:val="single" w:sz="4" w:color="D9D9D9"/>
+        </w:tblBorders>
       </w:tblPr>
       <w:tblGrid>
         <w:gridCol w:w="3389"/>
@@ -3630,6 +3670,14 @@
         <w:tblW w:type="auto" w:w="0"/>
         <w:jc w:val="center"/>
         <w:tblLook w:firstColumn="1" w:firstRow="1" w:lastColumn="0" w:lastRow="0" w:noHBand="0" w:noVBand="1" w:val="04A0"/>
+        <w:tblBorders>
+          <w:top w:val="single" w:sz="4" w:color="D9D9D9"/>
+          <w:left w:val="single" w:sz="4" w:color="D9D9D9"/>
+          <w:bottom w:val="single" w:sz="4" w:color="D9D9D9"/>
+          <w:right w:val="single" w:sz="4" w:color="D9D9D9"/>
+          <w:insideH w:val="single" w:sz="4" w:color="D9D9D9"/>
+          <w:insideV w:val="single" w:sz="4" w:color="D9D9D9"/>
+        </w:tblBorders>
       </w:tblPr>
       <w:tblGrid>
         <w:gridCol w:w="3389"/>
@@ -4019,6 +4067,14 @@
         <w:tblW w:type="auto" w:w="0"/>
         <w:jc w:val="center"/>
         <w:tblLook w:firstColumn="1" w:firstRow="1" w:lastColumn="0" w:lastRow="0" w:noHBand="0" w:noVBand="1" w:val="04A0"/>
+        <w:tblBorders>
+          <w:top w:val="single" w:sz="4" w:color="D9D9D9"/>
+          <w:left w:val="single" w:sz="4" w:color="D9D9D9"/>
+          <w:bottom w:val="single" w:sz="4" w:color="D9D9D9"/>
+          <w:right w:val="single" w:sz="4" w:color="D9D9D9"/>
+          <w:insideH w:val="single" w:sz="4" w:color="D9D9D9"/>
+          <w:insideV w:val="single" w:sz="4" w:color="D9D9D9"/>
+        </w:tblBorders>
       </w:tblPr>
       <w:tblGrid>
         <w:gridCol w:w="3389"/>
@@ -4505,6 +4561,14 @@
         <w:tblW w:type="auto" w:w="0"/>
         <w:jc w:val="center"/>
         <w:tblLook w:firstColumn="1" w:firstRow="1" w:lastColumn="0" w:lastRow="0" w:noHBand="0" w:noVBand="1" w:val="04A0"/>
+        <w:tblBorders>
+          <w:top w:val="single" w:sz="4" w:color="D9D9D9"/>
+          <w:left w:val="single" w:sz="4" w:color="D9D9D9"/>
+          <w:bottom w:val="single" w:sz="4" w:color="D9D9D9"/>
+          <w:right w:val="single" w:sz="4" w:color="D9D9D9"/>
+          <w:insideH w:val="single" w:sz="4" w:color="D9D9D9"/>
+          <w:insideV w:val="single" w:sz="4" w:color="D9D9D9"/>
+        </w:tblBorders>
       </w:tblPr>
       <w:tblGrid>
         <w:gridCol w:w="3389"/>
@@ -5079,6 +5143,14 @@
         <w:tblW w:type="auto" w:w="0"/>
         <w:jc w:val="center"/>
         <w:tblLook w:firstColumn="1" w:firstRow="1" w:lastColumn="0" w:lastRow="0" w:noHBand="0" w:noVBand="1" w:val="04A0"/>
+        <w:tblBorders>
+          <w:top w:val="single" w:sz="4" w:color="D9D9D9"/>
+          <w:left w:val="single" w:sz="4" w:color="D9D9D9"/>
+          <w:bottom w:val="single" w:sz="4" w:color="D9D9D9"/>
+          <w:right w:val="single" w:sz="4" w:color="D9D9D9"/>
+          <w:insideH w:val="single" w:sz="4" w:color="D9D9D9"/>
+          <w:insideV w:val="single" w:sz="4" w:color="D9D9D9"/>
+        </w:tblBorders>
       </w:tblPr>
       <w:tblGrid>
         <w:gridCol w:w="3389"/>
@@ -5234,7 +5306,7 @@
                 <w:color w:val="253C37"/>
                 <w:sz w:val="18"/>
               </w:rPr>
-              <w:t>7 页：封面、概览、情绪开场、代表记忆、长期副本、收束、感言</w:t>
+              <w:t>6 至 7 页：封面、概览、情绪开场、代表记忆、可选长期副本、收束、感言</w:t>
             </w:r>
           </w:p>
         </w:tc>
@@ -5325,7 +5397,7 @@
                 <w:color w:val="253C37"/>
                 <w:sz w:val="18"/>
               </w:rPr>
-              <w:t>12 页：封面、概览、季节、长期副本、情绪、代表记忆、原话、日常、收束、感言</w:t>
+              <w:t>11 至 12 页：封面、概览、季节、可选长期副本、情绪、代表记忆、原话、日常、收束、感言</w:t>
             </w:r>
           </w:p>
         </w:tc>
@@ -5419,6 +5491,14 @@
         <w:tblW w:type="auto" w:w="0"/>
         <w:jc w:val="center"/>
         <w:tblLook w:firstColumn="1" w:firstRow="1" w:lastColumn="0" w:lastRow="0" w:noHBand="0" w:noVBand="1" w:val="04A0"/>
+        <w:tblBorders>
+          <w:top w:val="single" w:sz="4" w:color="D9D9D9"/>
+          <w:left w:val="single" w:sz="4" w:color="D9D9D9"/>
+          <w:bottom w:val="single" w:sz="4" w:color="D9D9D9"/>
+          <w:right w:val="single" w:sz="4" w:color="D9D9D9"/>
+          <w:insideH w:val="single" w:sz="4" w:color="D9D9D9"/>
+          <w:insideV w:val="single" w:sz="4" w:color="D9D9D9"/>
+        </w:tblBorders>
       </w:tblPr>
       <w:tblGrid>
         <w:gridCol w:w="5083"/>
@@ -5607,7 +5687,7 @@
                 <w:color w:val="253C37"/>
                 <w:sz w:val="18"/>
               </w:rPr>
-              <w:t>按月度或年度筛选，查看已生成、未读和已读总结，并可删除单份总结</w:t>
+              <w:t>按月度或年度筛选，打开已生成总结并恢复观看；删除接口已实现，当前界面尚未提供删除按钮</w:t>
             </w:r>
           </w:p>
         </w:tc>
@@ -5731,7 +5811,7 @@
                 <w:color w:val="253C37"/>
                 <w:sz w:val="18"/>
               </w:rPr>
-              <w:t>重新读取当前记忆和授权设置，覆盖旧页面；空周期则移除旧总结</w:t>
+              <w:t>重新读取当前记忆和授权设置，覆盖旧页面；非空周期保留感言，空周期删除旧总结及其感言</w:t>
             </w:r>
           </w:p>
         </w:tc>
@@ -5832,7 +5912,7 @@
         <w:pStyle w:val="ListBullet"/>
       </w:pPr>
       <w:r>
-        <w:t>AI 仅改写第二人称旁白。后端逐页校验页面数量、事实引用和数字，禁止引入快照外事实。</w:t>
+        <w:t>AI 仅改写第二人称旁白。后端校验页数、顺序、已知事实引用和阿拉伯数字；自然语言语义校验仍有边界，默认使用本地模板。</w:t>
       </w:r>
     </w:p>
     <w:p>
@@ -5840,7 +5920,69 @@
         <w:pStyle w:val="ListBullet"/>
       </w:pPr>
       <w:r>
-        <w:t>单条记忆可以设置“不参与总结”；软删除记忆和被排除记忆都不会进入新快照。</w:t>
+        <w:t>单条记忆“不参与总结”和授权偏好更新已有 API；独立设置界面尚待补齐。被排除和已删除记忆不会进入新快照。</w:t>
+      </w:r>
+    </w:p>
+    <w:p>
+      <w:pPr>
+        <w:pStyle w:val="Heading2"/>
+      </w:pPr>
+      <w:r>
+        <w:t>7.5 情绪电影完整业务流程</w:t>
+      </w:r>
+    </w:p>
+    <w:p>
+      <w:pPr>
+        <w:keepNext/>
+        <w:jc w:val="center"/>
+      </w:pPr>
+      <w:r>
+        <w:drawing>
+          <wp:inline xmlns:a="http://schemas.openxmlformats.org/drawingml/2006/main" xmlns:pic="http://schemas.openxmlformats.org/drawingml/2006/picture">
+            <wp:extent cx="5715000" cy="4898571"/>
+            <wp:docPr id="2" name="Picture 2" descr="月度年度总结从授权到生成和回看的实际流程"/>
+            <wp:cNvGraphicFramePr>
+              <a:graphicFrameLocks noChangeAspect="1"/>
+            </wp:cNvGraphicFramePr>
+            <a:graphic>
+              <a:graphicData uri="http://schemas.openxmlformats.org/drawingml/2006/picture">
+                <pic:pic>
+                  <pic:nvPicPr>
+                    <pic:cNvPr id="0" name="照片记忆本情绪电影流程图.png"/>
+                    <pic:cNvPicPr/>
+                  </pic:nvPicPr>
+                  <pic:blipFill>
+                    <a:blip r:embed="rId11"/>
+                    <a:stretch>
+                      <a:fillRect/>
+                    </a:stretch>
+                  </pic:blipFill>
+                  <pic:spPr>
+                    <a:xfrm>
+                      <a:off x="0" y="0"/>
+                      <a:ext cx="5715000" cy="4898571"/>
+                    </a:xfrm>
+                    <a:prstGeom prst="rect"/>
+                  </pic:spPr>
+                </pic:pic>
+              </a:graphicData>
+            </a:graphic>
+          </wp:inline>
+        </w:drawing>
+      </w:r>
+    </w:p>
+    <w:p>
+      <w:pPr>
+        <w:spacing w:after="200"/>
+        <w:jc w:val="center"/>
+      </w:pPr>
+      <w:r>
+        <w:rPr>
+          <w:rFonts w:ascii="Microsoft YaHei" w:hAnsi="Microsoft YaHei" w:eastAsia="Microsoft YaHei"/>
+          <w:color w:val="66756F"/>
+          <w:sz w:val="18"/>
+        </w:rPr>
+        <w:t>月度年度总结从授权到生成和回看的实际流程</w:t>
       </w:r>
     </w:p>
     <w:p>
@@ -5865,6 +6007,14 @@
         <w:tblW w:type="auto" w:w="0"/>
         <w:jc w:val="center"/>
         <w:tblLook w:firstColumn="1" w:firstRow="1" w:lastColumn="0" w:lastRow="0" w:noHBand="0" w:noVBand="1" w:val="04A0"/>
+        <w:tblBorders>
+          <w:top w:val="single" w:sz="4" w:color="D9D9D9"/>
+          <w:left w:val="single" w:sz="4" w:color="D9D9D9"/>
+          <w:bottom w:val="single" w:sz="4" w:color="D9D9D9"/>
+          <w:right w:val="single" w:sz="4" w:color="D9D9D9"/>
+          <w:insideH w:val="single" w:sz="4" w:color="D9D9D9"/>
+          <w:insideV w:val="single" w:sz="4" w:color="D9D9D9"/>
+        </w:tblBorders>
       </w:tblPr>
       <w:tblGrid>
         <w:gridCol w:w="3389"/>
@@ -6571,7 +6721,7 @@
     </w:p>
     <w:p>
       <w:r>
-        <w:t>服务器导出覆盖照片、记忆、主题、长期副本、记忆回声、回声感言和回声偏好。重要日子及自定义心情和状态的候选列表仍保存在浏览器 IndexedDB 或 localStorage；记忆中已经使用的心情和状态会随记忆导出。后续版本应把这两类浏览器数据迁移到 PostgreSQL，纳入统一备份。</w:t>
+        <w:t>服务器 JSON 和 ZIP 导出覆盖照片、记忆、主题、长期副本、记忆回声、回声感言和回声偏好。新增情绪电影快照、故事页、总结感言与总结偏好尚未纳入 JSON 和 ZIP 迁移包；它们会随完整 PostgreSQL 原生数据库备份保存。重要日子及自定义心情和状态的候选列表仍在浏览器 IndexedDB 或 localStorage；已经用于记忆的心情和状态随记忆导出。原生数据库备份不包含原图文件，应同时保存照片 ZIP。</w:t>
       </w:r>
     </w:p>
     <w:p>
@@ -6590,8 +6740,8 @@
       <w:r>
         <w:drawing>
           <wp:inline xmlns:a="http://schemas.openxmlformats.org/drawingml/2006/main" xmlns:pic="http://schemas.openxmlformats.org/drawingml/2006/picture">
-            <wp:extent cx="6400800" cy="4267733"/>
-            <wp:docPr id="2" name="Picture 2"/>
+            <wp:extent cx="6400800" cy="5105400"/>
+            <wp:docPr id="3" name="Picture 3" descr="照片记忆本完整业务逻辑流程图"/>
             <wp:cNvGraphicFramePr>
               <a:graphicFrameLocks noChangeAspect="1"/>
             </wp:cNvGraphicFramePr>
@@ -6603,7 +6753,7 @@
                     <pic:cNvPicPr/>
                   </pic:nvPicPr>
                   <pic:blipFill>
-                    <a:blip r:embed="rId11"/>
+                    <a:blip r:embed="rId12"/>
                     <a:stretch>
                       <a:fillRect/>
                     </a:stretch>
@@ -6611,7 +6761,7 @@
                   <pic:spPr>
                     <a:xfrm>
                       <a:off x="0" y="0"/>
-                      <a:ext cx="6400800" cy="4267733"/>
+                      <a:ext cx="6400800" cy="5105400"/>
                     </a:xfrm>
                     <a:prstGeom prst="rect"/>
                   </pic:spPr>
@@ -6650,6 +6800,14 @@
         <w:tblW w:type="auto" w:w="0"/>
         <w:jc w:val="center"/>
         <w:tblLook w:firstColumn="1" w:firstRow="1" w:lastColumn="0" w:lastRow="0" w:noHBand="0" w:noVBand="1" w:val="04A0"/>
+        <w:tblBorders>
+          <w:top w:val="single" w:sz="4" w:color="D9D9D9"/>
+          <w:left w:val="single" w:sz="4" w:color="D9D9D9"/>
+          <w:bottom w:val="single" w:sz="4" w:color="D9D9D9"/>
+          <w:right w:val="single" w:sz="4" w:color="D9D9D9"/>
+          <w:insideH w:val="single" w:sz="4" w:color="D9D9D9"/>
+          <w:insideV w:val="single" w:sz="4" w:color="D9D9D9"/>
+        </w:tblBorders>
       </w:tblPr>
       <w:tblGrid>
         <w:gridCol w:w="5083"/>
@@ -7359,6 +7517,14 @@
         <w:tblW w:type="auto" w:w="0"/>
         <w:jc w:val="center"/>
         <w:tblLook w:firstColumn="1" w:firstRow="1" w:lastColumn="0" w:lastRow="0" w:noHBand="0" w:noVBand="1" w:val="04A0"/>
+        <w:tblBorders>
+          <w:top w:val="single" w:sz="4" w:color="D9D9D9"/>
+          <w:left w:val="single" w:sz="4" w:color="D9D9D9"/>
+          <w:bottom w:val="single" w:sz="4" w:color="D9D9D9"/>
+          <w:right w:val="single" w:sz="4" w:color="D9D9D9"/>
+          <w:insideH w:val="single" w:sz="4" w:color="D9D9D9"/>
+          <w:insideV w:val="single" w:sz="4" w:color="D9D9D9"/>
+        </w:tblBorders>
       </w:tblPr>
       <w:tblGrid>
         <w:gridCol w:w="5083"/>
@@ -7886,6 +8052,14 @@
         <w:tblW w:type="auto" w:w="0"/>
         <w:jc w:val="center"/>
         <w:tblLook w:firstColumn="1" w:firstRow="1" w:lastColumn="0" w:lastRow="0" w:noHBand="0" w:noVBand="1" w:val="04A0"/>
+        <w:tblBorders>
+          <w:top w:val="single" w:sz="4" w:color="D9D9D9"/>
+          <w:left w:val="single" w:sz="4" w:color="D9D9D9"/>
+          <w:bottom w:val="single" w:sz="4" w:color="D9D9D9"/>
+          <w:right w:val="single" w:sz="4" w:color="D9D9D9"/>
+          <w:insideH w:val="single" w:sz="4" w:color="D9D9D9"/>
+          <w:insideV w:val="single" w:sz="4" w:color="D9D9D9"/>
+        </w:tblBorders>
       </w:tblPr>
       <w:tblGrid>
         <w:gridCol w:w="3389"/>
@@ -9609,9 +9783,6 @@
     <w:qFormat/>
     <w:rsid w:val="00FC693F"/>
     <w:pPr>
-      <w:pBdr>
-        <w:bottom w:val="single" w:sz="8" w:space="4" w:color="4F81BD" w:themeColor="accent1"/>
-      </w:pBdr>
       <w:spacing w:after="280" w:line="240" w:lineRule="auto"/>
       <w:contextualSpacing/>
     </w:pPr>
@@ -10107,9 +10278,6 @@
     <w:qFormat/>
     <w:rsid w:val="00FC693F"/>
     <w:pPr>
-      <w:pBdr>
-        <w:bottom w:val="single" w:sz="4" w:space="4" w:color="4F81BD" w:themeColor="accent1"/>
-      </w:pBdr>
       <w:spacing w:before="200" w:after="280"/>
       <w:ind w:left="936" w:right="936"/>
     </w:pPr>

</xml_diff>

<commit_message>
docs: update complete product documentation
</commit_message>
<xml_diff>
--- a/docs/照片记忆本产品需求文档_PRD_V2.docx
+++ b/docs/照片记忆本产品需求文档_PRD_V2.docx
@@ -165,7 +165,7 @@
                 <w:color w:val="253C37"/>
                 <w:sz w:val="18"/>
               </w:rPr>
-              <w:t>V4.1</w:t>
+              <w:t>V4.3</w:t>
             </w:r>
           </w:p>
         </w:tc>
@@ -228,7 +228,7 @@
                 <w:color w:val="253C37"/>
                 <w:sz w:val="18"/>
               </w:rPr>
-              <w:t>2026年10月14日</w:t>
+              <w:t>2026年10月15日</w:t>
             </w:r>
           </w:p>
         </w:tc>
@@ -453,7 +453,7 @@
         <w:t xml:space="preserve">结论  </w:t>
       </w:r>
       <w:r>
-        <w:t>照片记忆本定位为本地优先的情感型记忆产品。用户先保存照片，再按需要补充标题、备忘录、心情、状态和主题；系统通过长期副本、记忆回声、月度年度总结，把零散照片转化为可以持续回看的个人记忆档案。</w:t>
+        <w:t>照片记忆本定位为本地优先的情感型记忆产品。用户先保存照片，再按需要补充标题、备忘录、心情、状态和主题；系统通过记忆寻迹、长期副本、记忆回声、月度年度总结，把零散照片转化为可以主动寻找、持续回看的个人记忆档案。</w:t>
       </w:r>
     </w:p>
     <w:p>
@@ -461,7 +461,7 @@
         <w:spacing w:after="240"/>
       </w:pPr>
       <w:r>
-        <w:t>本版覆盖当前网页 MVP 的全部功能、情绪电影、数据安全能力和业务边界。默认使用本地模板生成总结；只有用户主动开启云端 AI 后，后端才会发送授权范围内的最小结构化内容。运行数据固定保存在 D 盘项目目录和本机 PostgreSQL。</w:t>
+        <w:t>本版覆盖当前网页 MVP 的全部功能、记忆寻迹、情绪电影、数据安全能力和业务边界。默认使用本地模板生成总结；只有用户主动开启云端 AI 后，后端才会发送授权范围内的最小结构化内容。运行数据固定保存在 D 盘项目目录和本机 PostgreSQL。</w:t>
       </w:r>
     </w:p>
     <w:p>
@@ -472,7 +472,7 @@
       <w:r>
         <w:drawing>
           <wp:inline xmlns:a="http://schemas.openxmlformats.org/drawingml/2006/main" xmlns:pic="http://schemas.openxmlformats.org/drawingml/2006/picture">
-            <wp:extent cx="6400800" cy="4838700"/>
+            <wp:extent cx="6400800" cy="6819900"/>
             <wp:docPr id="1" name="Picture 1" descr="产品功能总览示意图"/>
             <wp:cNvGraphicFramePr>
               <a:graphicFrameLocks noChangeAspect="1"/>
@@ -493,7 +493,7 @@
                   <pic:spPr>
                     <a:xfrm>
                       <a:off x="0" y="0"/>
-                      <a:ext cx="6400800" cy="4838700"/>
+                      <a:ext cx="6400800" cy="6819900"/>
                     </a:xfrm>
                     <a:prstGeom prst="rect"/>
                   </pic:spPr>
@@ -568,7 +568,7 @@
         <w:ind w:left="317" w:hanging="317"/>
       </w:pPr>
       <w:r>
-        <w:t>5. 主题与长期副本</w:t>
+        <w:t>5. 记忆寻迹</w:t>
       </w:r>
     </w:p>
     <w:p>
@@ -576,7 +576,7 @@
         <w:ind w:left="317" w:hanging="317"/>
       </w:pPr>
       <w:r>
-        <w:t>6. 记忆回声</w:t>
+        <w:t>6. 主题与长期副本</w:t>
       </w:r>
     </w:p>
     <w:p>
@@ -584,7 +584,7 @@
         <w:ind w:left="317" w:hanging="317"/>
       </w:pPr>
       <w:r>
-        <w:t>7. 月度与年度总结</w:t>
+        <w:t>7. 记忆回声</w:t>
       </w:r>
     </w:p>
     <w:p>
@@ -592,7 +592,7 @@
         <w:ind w:left="317" w:hanging="317"/>
       </w:pPr>
       <w:r>
-        <w:t>8. 数据保险箱与应用锁</w:t>
+        <w:t>8. 月度与年度总结</w:t>
       </w:r>
     </w:p>
     <w:p>
@@ -600,7 +600,7 @@
         <w:ind w:left="317" w:hanging="317"/>
       </w:pPr>
       <w:r>
-        <w:t>9. 完整业务逻辑</w:t>
+        <w:t>9. 数据保险箱与应用锁</w:t>
       </w:r>
     </w:p>
     <w:p>
@@ -608,7 +608,7 @@
         <w:ind w:left="317" w:hanging="317"/>
       </w:pPr>
       <w:r>
-        <w:t>10. 业务规则与异常处理</w:t>
+        <w:t>10. 完整业务逻辑</w:t>
       </w:r>
     </w:p>
     <w:p>
@@ -616,7 +616,7 @@
         <w:ind w:left="317" w:hanging="317"/>
       </w:pPr>
       <w:r>
-        <w:t>11. 非功能要求</w:t>
+        <w:t>11. 业务规则与异常处理</w:t>
       </w:r>
     </w:p>
     <w:p>
@@ -624,7 +624,7 @@
         <w:ind w:left="317" w:hanging="317"/>
       </w:pPr>
       <w:r>
-        <w:t>12. 验收标准与预期效果</w:t>
+        <w:t>12. 非功能要求</w:t>
       </w:r>
     </w:p>
     <w:p>
@@ -632,7 +632,15 @@
         <w:ind w:left="317" w:hanging="317"/>
       </w:pPr>
       <w:r>
-        <w:t>13. 版本边界与后续规划</w:t>
+        <w:t>13. 验收标准与预期效果</w:t>
+      </w:r>
+    </w:p>
+    <w:p>
+      <w:pPr>
+        <w:ind w:left="317" w:hanging="317"/>
+      </w:pPr>
+      <w:r>
+        <w:t>14. 版本边界与后续规划</w:t>
       </w:r>
     </w:p>
     <w:p>
@@ -691,6 +699,14 @@
       </w:pPr>
       <w:r>
         <w:t>形成长期叙事。考研、恋爱、读研等主题可以生成长期副本时间线。</w:t>
+      </w:r>
+    </w:p>
+    <w:p>
+      <w:pPr>
+        <w:pStyle w:val="ListBullet"/>
+      </w:pPr>
+      <w:r>
+        <w:t>支持主动寻找。用户可以用一句自然语言或明确筛选条件，从多年记录里找回某段经历。</w:t>
       </w:r>
     </w:p>
     <w:p>
@@ -2182,7 +2198,7 @@
                 <w:color w:val="253C37"/>
                 <w:sz w:val="18"/>
               </w:rPr>
-              <w:t>照片卡片  搜索  添加记忆  记忆回声  总结入口</w:t>
+              <w:t>照片卡片  寻迹快捷入口  添加记忆  记忆回声  总结入口</w:t>
             </w:r>
           </w:p>
         </w:tc>
@@ -2244,7 +2260,7 @@
                 <w:color w:val="253C37"/>
                 <w:sz w:val="18"/>
               </w:rPr>
-              <w:t>时间线</w:t>
+              <w:t>记忆寻迹</w:t>
             </w:r>
           </w:p>
         </w:tc>
@@ -2273,7 +2289,7 @@
                 <w:color w:val="253C37"/>
                 <w:sz w:val="18"/>
               </w:rPr>
-              <w:t>按事件日期分组浏览全部记忆</w:t>
+              <w:t>自然语言解析  组合筛选  叙事时间轴  最近搜索</w:t>
             </w:r>
           </w:p>
         </w:tc>
@@ -3640,7 +3656,12 @@
         <w:pStyle w:val="Heading1"/>
       </w:pPr>
       <w:r>
-        <w:t>5 主题与长期副本</w:t>
+        <w:t>5 记忆寻迹</w:t>
+      </w:r>
+    </w:p>
+    <w:p>
+      <w:r>
+        <w:t>记忆寻迹是主动回看入口，替代原来只按日期浏览的独立时间线。首页提供明确的按钮入口；查询描述、条件确认、结果、编辑和翻页都在独立页面完成。</w:t>
       </w:r>
     </w:p>
     <w:p>
@@ -3648,7 +3669,713 @@
         <w:pStyle w:val="Heading2"/>
       </w:pPr>
       <w:r>
-        <w:t>5.1 主题规则</w:t>
+        <w:t>5.1 查询输入与确认</w:t>
+      </w:r>
+    </w:p>
+    <w:tbl>
+      <w:tblPr>
+        <w:tblStyle w:val="TableGrid"/>
+        <w:tblW w:type="auto" w:w="0"/>
+        <w:jc w:val="center"/>
+        <w:tblLook w:firstColumn="1" w:firstRow="1" w:lastColumn="0" w:lastRow="0" w:noHBand="0" w:noVBand="1" w:val="04A0"/>
+        <w:tblBorders>
+          <w:top w:val="single" w:sz="4" w:color="D9D9D9"/>
+          <w:left w:val="single" w:sz="4" w:color="D9D9D9"/>
+          <w:bottom w:val="single" w:sz="4" w:color="D9D9D9"/>
+          <w:right w:val="single" w:sz="4" w:color="D9D9D9"/>
+          <w:insideH w:val="single" w:sz="4" w:color="D9D9D9"/>
+          <w:insideV w:val="single" w:sz="4" w:color="D9D9D9"/>
+        </w:tblBorders>
+      </w:tblPr>
+      <w:tblGrid>
+        <w:gridCol w:w="3389"/>
+        <w:gridCol w:w="3389"/>
+        <w:gridCol w:w="3389"/>
+      </w:tblGrid>
+      <w:tr>
+        <w:trPr>
+          <w:tblHeader w:val="true"/>
+          <w:cantSplit/>
+        </w:trPr>
+        <w:tc>
+          <w:tcPr>
+            <w:tcW w:type="dxa" w:w="1512"/>
+            <w:shd w:fill="4F7E78"/>
+            <w:vAlign w:val="center"/>
+            <w:tcMar>
+              <w:top w:w="110" w:type="dxa"/>
+              <w:start w:w="120" w:type="dxa"/>
+              <w:bottom w:w="110" w:type="dxa"/>
+              <w:end w:w="120" w:type="dxa"/>
+            </w:tcMar>
+          </w:tcPr>
+          <w:p>
+            <w:pPr>
+              <w:spacing w:after="0" w:line="288" w:lineRule="auto"/>
+              <w:jc w:val="center"/>
+            </w:pPr>
+            <w:r/>
+            <w:r>
+              <w:rPr>
+                <w:rFonts w:ascii="Microsoft YaHei" w:hAnsi="Microsoft YaHei" w:eastAsia="Microsoft YaHei"/>
+                <w:b/>
+                <w:color w:val="FFFFFF"/>
+                <w:sz w:val="18"/>
+              </w:rPr>
+              <w:t>条件</w:t>
+            </w:r>
+          </w:p>
+        </w:tc>
+        <w:tc>
+          <w:tcPr>
+            <w:tcW w:type="dxa" w:w="4680"/>
+            <w:shd w:fill="4F7E78"/>
+            <w:vAlign w:val="center"/>
+            <w:tcMar>
+              <w:top w:w="110" w:type="dxa"/>
+              <w:start w:w="120" w:type="dxa"/>
+              <w:bottom w:w="110" w:type="dxa"/>
+              <w:end w:w="120" w:type="dxa"/>
+            </w:tcMar>
+          </w:tcPr>
+          <w:p>
+            <w:pPr>
+              <w:spacing w:after="0" w:line="288" w:lineRule="auto"/>
+              <w:jc w:val="center"/>
+            </w:pPr>
+            <w:r/>
+            <w:r>
+              <w:rPr>
+                <w:rFonts w:ascii="Microsoft YaHei" w:hAnsi="Microsoft YaHei" w:eastAsia="Microsoft YaHei"/>
+                <w:b/>
+                <w:color w:val="FFFFFF"/>
+                <w:sz w:val="18"/>
+              </w:rPr>
+              <w:t>识别与输入规则</w:t>
+            </w:r>
+          </w:p>
+        </w:tc>
+        <w:tc>
+          <w:tcPr>
+            <w:tcW w:type="dxa" w:w="3671"/>
+            <w:shd w:fill="4F7E78"/>
+            <w:vAlign w:val="center"/>
+            <w:tcMar>
+              <w:top w:w="110" w:type="dxa"/>
+              <w:start w:w="120" w:type="dxa"/>
+              <w:bottom w:w="110" w:type="dxa"/>
+              <w:end w:w="120" w:type="dxa"/>
+            </w:tcMar>
+          </w:tcPr>
+          <w:p>
+            <w:pPr>
+              <w:spacing w:after="0" w:line="288" w:lineRule="auto"/>
+              <w:jc w:val="center"/>
+            </w:pPr>
+            <w:r/>
+            <w:r>
+              <w:rPr>
+                <w:rFonts w:ascii="Microsoft YaHei" w:hAnsi="Microsoft YaHei" w:eastAsia="Microsoft YaHei"/>
+                <w:b/>
+                <w:color w:val="FFFFFF"/>
+                <w:sz w:val="18"/>
+              </w:rPr>
+              <w:t>匹配规则</w:t>
+            </w:r>
+          </w:p>
+        </w:tc>
+      </w:tr>
+      <w:tr>
+        <w:trPr>
+          <w:cantSplit/>
+        </w:trPr>
+        <w:tc>
+          <w:tcPr>
+            <w:tcW w:type="dxa" w:w="1512"/>
+            <w:vAlign w:val="center"/>
+            <w:tcMar>
+              <w:top w:w="110" w:type="dxa"/>
+              <w:start w:w="120" w:type="dxa"/>
+              <w:bottom w:w="110" w:type="dxa"/>
+              <w:end w:w="120" w:type="dxa"/>
+            </w:tcMar>
+          </w:tcPr>
+          <w:p>
+            <w:pPr>
+              <w:spacing w:after="0" w:line="288" w:lineRule="auto"/>
+              <w:jc w:val="center"/>
+            </w:pPr>
+            <w:r/>
+            <w:r>
+              <w:rPr>
+                <w:rFonts w:ascii="Microsoft YaHei" w:hAnsi="Microsoft YaHei" w:eastAsia="Microsoft YaHei"/>
+                <w:b w:val="0"/>
+                <w:color w:val="253C37"/>
+                <w:sz w:val="18"/>
+              </w:rPr>
+              <w:t>日期</w:t>
+            </w:r>
+          </w:p>
+        </w:tc>
+        <w:tc>
+          <w:tcPr>
+            <w:tcW w:type="dxa" w:w="4680"/>
+            <w:vAlign w:val="center"/>
+            <w:tcMar>
+              <w:top w:w="110" w:type="dxa"/>
+              <w:start w:w="120" w:type="dxa"/>
+              <w:bottom w:w="110" w:type="dxa"/>
+              <w:end w:w="120" w:type="dxa"/>
+            </w:tcMar>
+          </w:tcPr>
+          <w:p>
+            <w:pPr>
+              <w:spacing w:after="0" w:line="288" w:lineRule="auto"/>
+              <w:jc w:val="left"/>
+            </w:pPr>
+            <w:r/>
+            <w:r>
+              <w:rPr>
+                <w:rFonts w:ascii="Microsoft YaHei" w:hAnsi="Microsoft YaHei" w:eastAsia="Microsoft YaHei"/>
+                <w:b w:val="0"/>
+                <w:color w:val="253C37"/>
+                <w:sz w:val="18"/>
+              </w:rPr>
+              <w:t>支持今天、昨天、上周、上个月、今年、去年等明确表达，也可手动选择起止日期；首版不识别季节和模糊时间</w:t>
+            </w:r>
+          </w:p>
+        </w:tc>
+        <w:tc>
+          <w:tcPr>
+            <w:tcW w:type="dxa" w:w="3671"/>
+            <w:vAlign w:val="center"/>
+            <w:tcMar>
+              <w:top w:w="110" w:type="dxa"/>
+              <w:start w:w="120" w:type="dxa"/>
+              <w:bottom w:w="110" w:type="dxa"/>
+              <w:end w:w="120" w:type="dxa"/>
+            </w:tcMar>
+          </w:tcPr>
+          <w:p>
+            <w:pPr>
+              <w:spacing w:after="0" w:line="288" w:lineRule="auto"/>
+              <w:jc w:val="left"/>
+            </w:pPr>
+            <w:r/>
+            <w:r>
+              <w:rPr>
+                <w:rFonts w:ascii="Microsoft YaHei" w:hAnsi="Microsoft YaHei" w:eastAsia="Microsoft YaHei"/>
+                <w:b w:val="0"/>
+                <w:color w:val="253C37"/>
+                <w:sz w:val="18"/>
+              </w:rPr>
+              <w:t>上海时区左闭右开区间；非法日期和反向区间不执行</w:t>
+            </w:r>
+          </w:p>
+        </w:tc>
+      </w:tr>
+      <w:tr>
+        <w:trPr>
+          <w:cantSplit/>
+        </w:trPr>
+        <w:tc>
+          <w:tcPr>
+            <w:tcW w:type="dxa" w:w="1512"/>
+            <w:shd w:fill="EEF5F2"/>
+            <w:vAlign w:val="center"/>
+            <w:tcMar>
+              <w:top w:w="110" w:type="dxa"/>
+              <w:start w:w="120" w:type="dxa"/>
+              <w:bottom w:w="110" w:type="dxa"/>
+              <w:end w:w="120" w:type="dxa"/>
+            </w:tcMar>
+          </w:tcPr>
+          <w:p>
+            <w:pPr>
+              <w:spacing w:after="0" w:line="288" w:lineRule="auto"/>
+              <w:jc w:val="center"/>
+            </w:pPr>
+            <w:r/>
+            <w:r>
+              <w:rPr>
+                <w:rFonts w:ascii="Microsoft YaHei" w:hAnsi="Microsoft YaHei" w:eastAsia="Microsoft YaHei"/>
+                <w:b w:val="0"/>
+                <w:color w:val="253C37"/>
+                <w:sz w:val="18"/>
+              </w:rPr>
+              <w:t>心情</w:t>
+            </w:r>
+          </w:p>
+        </w:tc>
+        <w:tc>
+          <w:tcPr>
+            <w:tcW w:type="dxa" w:w="4680"/>
+            <w:shd w:fill="EEF5F2"/>
+            <w:vAlign w:val="center"/>
+            <w:tcMar>
+              <w:top w:w="110" w:type="dxa"/>
+              <w:start w:w="120" w:type="dxa"/>
+              <w:bottom w:w="110" w:type="dxa"/>
+              <w:end w:w="120" w:type="dxa"/>
+            </w:tcMar>
+          </w:tcPr>
+          <w:p>
+            <w:pPr>
+              <w:spacing w:after="0" w:line="288" w:lineRule="auto"/>
+              <w:jc w:val="left"/>
+            </w:pPr>
+            <w:r/>
+            <w:r>
+              <w:rPr>
+                <w:rFonts w:ascii="Microsoft YaHei" w:hAnsi="Microsoft YaHei" w:eastAsia="Microsoft YaHei"/>
+                <w:b w:val="0"/>
+                <w:color w:val="253C37"/>
+                <w:sz w:val="18"/>
+              </w:rPr>
+              <w:t>自然语言或单选筛选</w:t>
+            </w:r>
+          </w:p>
+        </w:tc>
+        <w:tc>
+          <w:tcPr>
+            <w:tcW w:type="dxa" w:w="3671"/>
+            <w:shd w:fill="EEF5F2"/>
+            <w:vAlign w:val="center"/>
+            <w:tcMar>
+              <w:top w:w="110" w:type="dxa"/>
+              <w:start w:w="120" w:type="dxa"/>
+              <w:bottom w:w="110" w:type="dxa"/>
+              <w:end w:w="120" w:type="dxa"/>
+            </w:tcMar>
+          </w:tcPr>
+          <w:p>
+            <w:pPr>
+              <w:spacing w:after="0" w:line="288" w:lineRule="auto"/>
+              <w:jc w:val="left"/>
+            </w:pPr>
+            <w:r/>
+            <w:r>
+              <w:rPr>
+                <w:rFonts w:ascii="Microsoft YaHei" w:hAnsi="Microsoft YaHei" w:eastAsia="Microsoft YaHei"/>
+                <w:b w:val="0"/>
+                <w:color w:val="253C37"/>
+                <w:sz w:val="18"/>
+              </w:rPr>
+              <w:t>精确匹配一个心情</w:t>
+            </w:r>
+          </w:p>
+        </w:tc>
+      </w:tr>
+      <w:tr>
+        <w:trPr>
+          <w:cantSplit/>
+        </w:trPr>
+        <w:tc>
+          <w:tcPr>
+            <w:tcW w:type="dxa" w:w="1512"/>
+            <w:vAlign w:val="center"/>
+            <w:tcMar>
+              <w:top w:w="110" w:type="dxa"/>
+              <w:start w:w="120" w:type="dxa"/>
+              <w:bottom w:w="110" w:type="dxa"/>
+              <w:end w:w="120" w:type="dxa"/>
+            </w:tcMar>
+          </w:tcPr>
+          <w:p>
+            <w:pPr>
+              <w:spacing w:after="0" w:line="288" w:lineRule="auto"/>
+              <w:jc w:val="center"/>
+            </w:pPr>
+            <w:r/>
+            <w:r>
+              <w:rPr>
+                <w:rFonts w:ascii="Microsoft YaHei" w:hAnsi="Microsoft YaHei" w:eastAsia="Microsoft YaHei"/>
+                <w:b w:val="0"/>
+                <w:color w:val="253C37"/>
+                <w:sz w:val="18"/>
+              </w:rPr>
+              <w:t>状态</w:t>
+            </w:r>
+          </w:p>
+        </w:tc>
+        <w:tc>
+          <w:tcPr>
+            <w:tcW w:type="dxa" w:w="4680"/>
+            <w:vAlign w:val="center"/>
+            <w:tcMar>
+              <w:top w:w="110" w:type="dxa"/>
+              <w:start w:w="120" w:type="dxa"/>
+              <w:bottom w:w="110" w:type="dxa"/>
+              <w:end w:w="120" w:type="dxa"/>
+            </w:tcMar>
+          </w:tcPr>
+          <w:p>
+            <w:pPr>
+              <w:spacing w:after="0" w:line="288" w:lineRule="auto"/>
+              <w:jc w:val="left"/>
+            </w:pPr>
+            <w:r/>
+            <w:r>
+              <w:rPr>
+                <w:rFonts w:ascii="Microsoft YaHei" w:hAnsi="Microsoft YaHei" w:eastAsia="Microsoft YaHei"/>
+                <w:b w:val="0"/>
+                <w:color w:val="253C37"/>
+                <w:sz w:val="18"/>
+              </w:rPr>
+              <w:t>自然语言或多选筛选</w:t>
+            </w:r>
+          </w:p>
+        </w:tc>
+        <w:tc>
+          <w:tcPr>
+            <w:tcW w:type="dxa" w:w="3671"/>
+            <w:vAlign w:val="center"/>
+            <w:tcMar>
+              <w:top w:w="110" w:type="dxa"/>
+              <w:start w:w="120" w:type="dxa"/>
+              <w:bottom w:w="110" w:type="dxa"/>
+              <w:end w:w="120" w:type="dxa"/>
+            </w:tcMar>
+          </w:tcPr>
+          <w:p>
+            <w:pPr>
+              <w:spacing w:after="0" w:line="288" w:lineRule="auto"/>
+              <w:jc w:val="left"/>
+            </w:pPr>
+            <w:r/>
+            <w:r>
+              <w:rPr>
+                <w:rFonts w:ascii="Microsoft YaHei" w:hAnsi="Microsoft YaHei" w:eastAsia="Microsoft YaHei"/>
+                <w:b w:val="0"/>
+                <w:color w:val="253C37"/>
+                <w:sz w:val="18"/>
+              </w:rPr>
+              <w:t>必须同时包含全部所选状态</w:t>
+            </w:r>
+          </w:p>
+        </w:tc>
+      </w:tr>
+      <w:tr>
+        <w:trPr>
+          <w:cantSplit/>
+        </w:trPr>
+        <w:tc>
+          <w:tcPr>
+            <w:tcW w:type="dxa" w:w="1512"/>
+            <w:shd w:fill="EEF5F2"/>
+            <w:vAlign w:val="center"/>
+            <w:tcMar>
+              <w:top w:w="110" w:type="dxa"/>
+              <w:start w:w="120" w:type="dxa"/>
+              <w:bottom w:w="110" w:type="dxa"/>
+              <w:end w:w="120" w:type="dxa"/>
+            </w:tcMar>
+          </w:tcPr>
+          <w:p>
+            <w:pPr>
+              <w:spacing w:after="0" w:line="288" w:lineRule="auto"/>
+              <w:jc w:val="center"/>
+            </w:pPr>
+            <w:r/>
+            <w:r>
+              <w:rPr>
+                <w:rFonts w:ascii="Microsoft YaHei" w:hAnsi="Microsoft YaHei" w:eastAsia="Microsoft YaHei"/>
+                <w:b w:val="0"/>
+                <w:color w:val="253C37"/>
+                <w:sz w:val="18"/>
+              </w:rPr>
+              <w:t>主题</w:t>
+            </w:r>
+          </w:p>
+        </w:tc>
+        <w:tc>
+          <w:tcPr>
+            <w:tcW w:type="dxa" w:w="4680"/>
+            <w:shd w:fill="EEF5F2"/>
+            <w:vAlign w:val="center"/>
+            <w:tcMar>
+              <w:top w:w="110" w:type="dxa"/>
+              <w:start w:w="120" w:type="dxa"/>
+              <w:bottom w:w="110" w:type="dxa"/>
+              <w:end w:w="120" w:type="dxa"/>
+            </w:tcMar>
+          </w:tcPr>
+          <w:p>
+            <w:pPr>
+              <w:spacing w:after="0" w:line="288" w:lineRule="auto"/>
+              <w:jc w:val="left"/>
+            </w:pPr>
+            <w:r/>
+            <w:r>
+              <w:rPr>
+                <w:rFonts w:ascii="Microsoft YaHei" w:hAnsi="Microsoft YaHei" w:eastAsia="Microsoft YaHei"/>
+                <w:b w:val="0"/>
+                <w:color w:val="253C37"/>
+                <w:sz w:val="18"/>
+              </w:rPr>
+              <w:t>自然语言或多选筛选</w:t>
+            </w:r>
+          </w:p>
+        </w:tc>
+        <w:tc>
+          <w:tcPr>
+            <w:tcW w:type="dxa" w:w="3671"/>
+            <w:shd w:fill="EEF5F2"/>
+            <w:vAlign w:val="center"/>
+            <w:tcMar>
+              <w:top w:w="110" w:type="dxa"/>
+              <w:start w:w="120" w:type="dxa"/>
+              <w:bottom w:w="110" w:type="dxa"/>
+              <w:end w:w="120" w:type="dxa"/>
+            </w:tcMar>
+          </w:tcPr>
+          <w:p>
+            <w:pPr>
+              <w:spacing w:after="0" w:line="288" w:lineRule="auto"/>
+              <w:jc w:val="left"/>
+            </w:pPr>
+            <w:r/>
+            <w:r>
+              <w:rPr>
+                <w:rFonts w:ascii="Microsoft YaHei" w:hAnsi="Microsoft YaHei" w:eastAsia="Microsoft YaHei"/>
+                <w:b w:val="0"/>
+                <w:color w:val="253C37"/>
+                <w:sz w:val="18"/>
+              </w:rPr>
+              <w:t>必须同时关联全部所选主题</w:t>
+            </w:r>
+          </w:p>
+        </w:tc>
+      </w:tr>
+      <w:tr>
+        <w:trPr>
+          <w:cantSplit/>
+        </w:trPr>
+        <w:tc>
+          <w:tcPr>
+            <w:tcW w:type="dxa" w:w="1512"/>
+            <w:vAlign w:val="center"/>
+            <w:tcMar>
+              <w:top w:w="110" w:type="dxa"/>
+              <w:start w:w="120" w:type="dxa"/>
+              <w:bottom w:w="110" w:type="dxa"/>
+              <w:end w:w="120" w:type="dxa"/>
+            </w:tcMar>
+          </w:tcPr>
+          <w:p>
+            <w:pPr>
+              <w:spacing w:after="0" w:line="288" w:lineRule="auto"/>
+              <w:jc w:val="center"/>
+            </w:pPr>
+            <w:r/>
+            <w:r>
+              <w:rPr>
+                <w:rFonts w:ascii="Microsoft YaHei" w:hAnsi="Microsoft YaHei" w:eastAsia="Microsoft YaHei"/>
+                <w:b w:val="0"/>
+                <w:color w:val="253C37"/>
+                <w:sz w:val="18"/>
+              </w:rPr>
+              <w:t>关键词</w:t>
+            </w:r>
+          </w:p>
+        </w:tc>
+        <w:tc>
+          <w:tcPr>
+            <w:tcW w:type="dxa" w:w="4680"/>
+            <w:vAlign w:val="center"/>
+            <w:tcMar>
+              <w:top w:w="110" w:type="dxa"/>
+              <w:start w:w="120" w:type="dxa"/>
+              <w:bottom w:w="110" w:type="dxa"/>
+              <w:end w:w="120" w:type="dxa"/>
+            </w:tcMar>
+          </w:tcPr>
+          <w:p>
+            <w:pPr>
+              <w:spacing w:after="0" w:line="288" w:lineRule="auto"/>
+              <w:jc w:val="left"/>
+            </w:pPr>
+            <w:r/>
+            <w:r>
+              <w:rPr>
+                <w:rFonts w:ascii="Microsoft YaHei" w:hAnsi="Microsoft YaHei" w:eastAsia="Microsoft YaHei"/>
+                <w:b w:val="0"/>
+                <w:color w:val="253C37"/>
+                <w:sz w:val="18"/>
+              </w:rPr>
+              <w:t>未识别文本先作为待确认关键词，空格分隔的文字拆成多个 AND 关键词；可新增或逐项删除</w:t>
+            </w:r>
+          </w:p>
+        </w:tc>
+        <w:tc>
+          <w:tcPr>
+            <w:tcW w:type="dxa" w:w="3671"/>
+            <w:vAlign w:val="center"/>
+            <w:tcMar>
+              <w:top w:w="110" w:type="dxa"/>
+              <w:start w:w="120" w:type="dxa"/>
+              <w:bottom w:w="110" w:type="dxa"/>
+              <w:end w:w="120" w:type="dxa"/>
+            </w:tcMar>
+          </w:tcPr>
+          <w:p>
+            <w:pPr>
+              <w:spacing w:after="0" w:line="288" w:lineRule="auto"/>
+              <w:jc w:val="left"/>
+            </w:pPr>
+            <w:r/>
+            <w:r>
+              <w:rPr>
+                <w:rFonts w:ascii="Microsoft YaHei" w:hAnsi="Microsoft YaHei" w:eastAsia="Microsoft YaHei"/>
+                <w:b w:val="0"/>
+                <w:color w:val="253C37"/>
+                <w:sz w:val="18"/>
+              </w:rPr>
+              <w:t>标题或备忘录；默认精确包含，用户可主动开启模糊匹配</w:t>
+            </w:r>
+          </w:p>
+        </w:tc>
+      </w:tr>
+    </w:tbl>
+    <w:p>
+      <w:pPr>
+        <w:spacing w:after="40"/>
+      </w:pPr>
+    </w:p>
+    <w:p>
+      <w:pPr>
+        <w:pStyle w:val="ListBullet"/>
+      </w:pPr>
+      <w:r>
+        <w:t>所有已确认条件按 AND 组合，不在用户不知情时扩大结果范围。</w:t>
+      </w:r>
+    </w:p>
+    <w:p>
+      <w:pPr>
+        <w:pStyle w:val="ListBullet"/>
+      </w:pPr>
+      <w:r>
+        <w:t>点击首页入口后进入独立页面；用户在页面内输入描述，解析结果以可移除标签展示，未知文本必须由用户确认后才查询。</w:t>
+      </w:r>
+    </w:p>
+    <w:p>
+      <w:pPr>
+        <w:pStyle w:val="ListBullet"/>
+      </w:pPr>
+      <w:r>
+        <w:t>最近二十条确认后的搜索条件仅保存在当前浏览器，可点击重用；不保存结果快照，不进入导出与数据库备份。</w:t>
+      </w:r>
+    </w:p>
+    <w:p>
+      <w:pPr>
+        <w:pStyle w:val="Heading2"/>
+      </w:pPr>
+      <w:r>
+        <w:t>5.2 结果时间轴与空结果</w:t>
+      </w:r>
+    </w:p>
+    <w:p>
+      <w:pPr>
+        <w:pStyle w:val="ListBullet"/>
+      </w:pPr>
+      <w:r>
+        <w:t>结果按上海时区的年月分组，卡片展示照片、时间、标题、心情、状态、主题和已关联长期副本。</w:t>
+      </w:r>
+    </w:p>
+    <w:p>
+      <w:pPr>
+        <w:pStyle w:val="ListBullet"/>
+      </w:pPr>
+      <w:r>
+        <w:t>首次固定加载五条；继续向下滚动自动加载下一页，并保留“继续加载”按钮作为可访问性兜底。</w:t>
+      </w:r>
+    </w:p>
+    <w:p>
+      <w:pPr>
+        <w:pStyle w:val="ListBullet"/>
+      </w:pPr>
+      <w:r>
+        <w:t>无关键词时默认按最新时间排序；带关键词时默认按相关度排序，也可切换最早时间或最新时间。相关度使用稳定分数、事件时间和 ID 排序。</w:t>
+      </w:r>
+    </w:p>
+    <w:p>
+      <w:pPr>
+        <w:pStyle w:val="ListBullet"/>
+      </w:pPr>
+      <w:r>
+        <w:t>进入独立页面且没有条件时自动加载全部记忆；从最近搜索复用条件时，已删除的心情、状态或主题会先被移除，并要求用户重新确认。</w:t>
+      </w:r>
+    </w:p>
+    <w:p>
+      <w:pPr>
+        <w:pStyle w:val="ListBullet"/>
+      </w:pPr>
+      <w:r>
+        <w:t>结果图片加载失败时切换到本地占位图并显示“照片暂时无法显示”，不会中断结果时间轴。</w:t>
+      </w:r>
+    </w:p>
+    <w:p>
+      <w:pPr>
+        <w:pStyle w:val="ListBullet"/>
+      </w:pPr>
+      <w:r>
+        <w:t>没有结果时最多给出三条逐项放宽建议。建议只描述将移除的一个条件，必须由用户点击后重新查询。</w:t>
+      </w:r>
+    </w:p>
+    <w:p>
+      <w:pPr>
+        <w:pStyle w:val="ListBullet"/>
+      </w:pPr>
+      <w:r>
+        <w:t>从结果打开详情可编辑或删除。保存后刷新当前已加载范围；删除后定位到最接近的仍存在结果。</w:t>
+      </w:r>
+    </w:p>
+    <w:p>
+      <w:pPr>
+        <w:pStyle w:val="Heading2"/>
+      </w:pPr>
+      <w:r>
+        <w:t>5.3 边界与隐私</w:t>
+      </w:r>
+    </w:p>
+    <w:p>
+      <w:pPr>
+        <w:pStyle w:val="ListBullet"/>
+      </w:pPr>
+      <w:r>
+        <w:t>离线时不伪造完整搜索结果；只提示需要连接本机后端，浏览器草稿仍可从原入口查看。</w:t>
+      </w:r>
+    </w:p>
+    <w:p>
+      <w:pPr>
+        <w:pStyle w:val="ListBullet"/>
+      </w:pPr>
+      <w:r>
+        <w:t>应用锁未解锁时不发起搜索请求，避免结果内容闪现。</w:t>
+      </w:r>
+    </w:p>
+    <w:p>
+      <w:pPr>
+        <w:pStyle w:val="ListBullet"/>
+      </w:pPr>
+      <w:r>
+        <w:t>模糊搜索仅在用户明确开启后使用，不执行语义推断、人物识别或自动改写查询。</w:t>
+      </w:r>
+    </w:p>
+    <w:p>
+      <w:pPr>
+        <w:pStyle w:val="Heading1"/>
+      </w:pPr>
+      <w:r>
+        <w:t>6 主题与长期副本</w:t>
+      </w:r>
+    </w:p>
+    <w:p>
+      <w:pPr>
+        <w:pStyle w:val="Heading2"/>
+      </w:pPr>
+      <w:r>
+        <w:t>6.1 主题规则</w:t>
       </w:r>
     </w:p>
     <w:p>
@@ -3661,7 +4388,7 @@
         <w:pStyle w:val="Heading2"/>
       </w:pPr>
       <w:r>
-        <w:t>5.2 首次授权</w:t>
+        <w:t>6.2 首次授权</w:t>
       </w:r>
     </w:p>
     <w:tbl>
@@ -4058,7 +4785,7 @@
         <w:pStyle w:val="Heading2"/>
       </w:pPr>
       <w:r>
-        <w:t>5.3 长期副本状态</w:t>
+        <w:t>6.3 长期副本状态</w:t>
       </w:r>
     </w:p>
     <w:tbl>
@@ -4547,7 +5274,7 @@
         <w:pStyle w:val="Heading1"/>
       </w:pPr>
       <w:r>
-        <w:t>6 记忆回声</w:t>
+        <w:t>7 记忆回声</w:t>
       </w:r>
     </w:p>
     <w:p>
@@ -5073,7 +5800,7 @@
         <w:pStyle w:val="Heading1"/>
       </w:pPr>
       <w:r>
-        <w:t>7 月度与年度总结</w:t>
+        <w:t>8 月度与年度总结</w:t>
       </w:r>
     </w:p>
     <w:p>
@@ -5086,7 +5813,7 @@
         <w:pStyle w:val="Heading2"/>
       </w:pPr>
       <w:r>
-        <w:t>7.1 生成与提醒</w:t>
+        <w:t>8.1 生成与提醒</w:t>
       </w:r>
     </w:p>
     <w:p>
@@ -5134,7 +5861,7 @@
         <w:pStyle w:val="Heading2"/>
       </w:pPr>
       <w:r>
-        <w:t>7.2 故事结构</w:t>
+        <w:t>8.2 故事结构</w:t>
       </w:r>
     </w:p>
     <w:tbl>
@@ -5482,7 +6209,7 @@
         <w:pStyle w:val="Heading2"/>
       </w:pPr>
       <w:r>
-        <w:t>7.3 回看与编辑</w:t>
+        <w:t>8.3 回看与编辑</w:t>
       </w:r>
     </w:p>
     <w:tbl>
@@ -5888,7 +6615,7 @@
         <w:pStyle w:val="Heading2"/>
       </w:pPr>
       <w:r>
-        <w:t>7.4 AI 与隐私</w:t>
+        <w:t>8.4 AI 与隐私</w:t>
       </w:r>
     </w:p>
     <w:p>
@@ -5928,7 +6655,7 @@
         <w:pStyle w:val="Heading2"/>
       </w:pPr>
       <w:r>
-        <w:t>7.5 情绪电影完整业务流程</w:t>
+        <w:t>8.5 情绪电影完整业务流程</w:t>
       </w:r>
     </w:p>
     <w:p>
@@ -5990,7 +6717,7 @@
         <w:pStyle w:val="Heading1"/>
       </w:pPr>
       <w:r>
-        <w:t>8 数据保险箱与应用锁</w:t>
+        <w:t>9 数据保险箱与应用锁</w:t>
       </w:r>
     </w:p>
     <w:p>
@@ -5998,7 +6725,7 @@
         <w:pStyle w:val="Heading2"/>
       </w:pPr>
       <w:r>
-        <w:t>8.1 数据保险箱</w:t>
+        <w:t>9.1 数据保险箱</w:t>
       </w:r>
     </w:p>
     <w:tbl>
@@ -6668,7 +7395,7 @@
         <w:pStyle w:val="Heading2"/>
       </w:pPr>
       <w:r>
-        <w:t>8.2 应用锁</w:t>
+        <w:t>9.2 应用锁</w:t>
       </w:r>
     </w:p>
     <w:p>
@@ -6716,7 +7443,7 @@
         <w:pStyle w:val="Heading2"/>
       </w:pPr>
       <w:r>
-        <w:t>8.3 当前数据边界</w:t>
+        <w:t>9.3 当前数据边界</w:t>
       </w:r>
     </w:p>
     <w:p>
@@ -6729,7 +7456,7 @@
         <w:pStyle w:val="Heading1"/>
       </w:pPr>
       <w:r>
-        <w:t>9 完整业务逻辑</w:t>
+        <w:t>10 完整业务逻辑</w:t>
       </w:r>
     </w:p>
     <w:p>
@@ -6791,7 +7518,7 @@
         <w:pStyle w:val="Heading1"/>
       </w:pPr>
       <w:r>
-        <w:t>10 业务规则与异常处理</w:t>
+        <w:t>11 业务规则与异常处理</w:t>
       </w:r>
     </w:p>
     <w:tbl>
@@ -7497,6 +8224,130 @@
           </w:p>
         </w:tc>
       </w:tr>
+      <w:tr>
+        <w:trPr>
+          <w:cantSplit/>
+        </w:trPr>
+        <w:tc>
+          <w:tcPr>
+            <w:tcW w:type="dxa" w:w="2880"/>
+            <w:vAlign w:val="center"/>
+            <w:tcMar>
+              <w:top w:w="110" w:type="dxa"/>
+              <w:start w:w="120" w:type="dxa"/>
+              <w:bottom w:w="110" w:type="dxa"/>
+              <w:end w:w="120" w:type="dxa"/>
+            </w:tcMar>
+          </w:tcPr>
+          <w:p>
+            <w:pPr>
+              <w:spacing w:after="0" w:line="288" w:lineRule="auto"/>
+              <w:jc w:val="center"/>
+            </w:pPr>
+            <w:r/>
+            <w:r>
+              <w:rPr>
+                <w:rFonts w:ascii="Microsoft YaHei" w:hAnsi="Microsoft YaHei" w:eastAsia="Microsoft YaHei"/>
+                <w:b w:val="0"/>
+                <w:color w:val="253C37"/>
+                <w:sz w:val="18"/>
+              </w:rPr>
+              <w:t>寻迹文本存在未知部分</w:t>
+            </w:r>
+          </w:p>
+        </w:tc>
+        <w:tc>
+          <w:tcPr>
+            <w:tcW w:type="dxa" w:w="7128"/>
+            <w:vAlign w:val="center"/>
+            <w:tcMar>
+              <w:top w:w="110" w:type="dxa"/>
+              <w:start w:w="120" w:type="dxa"/>
+              <w:bottom w:w="110" w:type="dxa"/>
+              <w:end w:w="120" w:type="dxa"/>
+            </w:tcMar>
+          </w:tcPr>
+          <w:p>
+            <w:pPr>
+              <w:spacing w:after="0" w:line="288" w:lineRule="auto"/>
+              <w:jc w:val="left"/>
+            </w:pPr>
+            <w:r/>
+            <w:r>
+              <w:rPr>
+                <w:rFonts w:ascii="Microsoft YaHei" w:hAnsi="Microsoft YaHei" w:eastAsia="Microsoft YaHei"/>
+                <w:b w:val="0"/>
+                <w:color w:val="253C37"/>
+                <w:sz w:val="18"/>
+              </w:rPr>
+              <w:t>先显示待确认关键词，不自动执行可能错误的查询</w:t>
+            </w:r>
+          </w:p>
+        </w:tc>
+      </w:tr>
+      <w:tr>
+        <w:trPr>
+          <w:cantSplit/>
+        </w:trPr>
+        <w:tc>
+          <w:tcPr>
+            <w:tcW w:type="dxa" w:w="2880"/>
+            <w:shd w:fill="EEF5F2"/>
+            <w:vAlign w:val="center"/>
+            <w:tcMar>
+              <w:top w:w="110" w:type="dxa"/>
+              <w:start w:w="120" w:type="dxa"/>
+              <w:bottom w:w="110" w:type="dxa"/>
+              <w:end w:w="120" w:type="dxa"/>
+            </w:tcMar>
+          </w:tcPr>
+          <w:p>
+            <w:pPr>
+              <w:spacing w:after="0" w:line="288" w:lineRule="auto"/>
+              <w:jc w:val="center"/>
+            </w:pPr>
+            <w:r/>
+            <w:r>
+              <w:rPr>
+                <w:rFonts w:ascii="Microsoft YaHei" w:hAnsi="Microsoft YaHei" w:eastAsia="Microsoft YaHei"/>
+                <w:b w:val="0"/>
+                <w:color w:val="253C37"/>
+                <w:sz w:val="18"/>
+              </w:rPr>
+              <w:t>寻迹请求被新查询取代</w:t>
+            </w:r>
+          </w:p>
+        </w:tc>
+        <w:tc>
+          <w:tcPr>
+            <w:tcW w:type="dxa" w:w="7128"/>
+            <w:shd w:fill="EEF5F2"/>
+            <w:vAlign w:val="center"/>
+            <w:tcMar>
+              <w:top w:w="110" w:type="dxa"/>
+              <w:start w:w="120" w:type="dxa"/>
+              <w:bottom w:w="110" w:type="dxa"/>
+              <w:end w:w="120" w:type="dxa"/>
+            </w:tcMar>
+          </w:tcPr>
+          <w:p>
+            <w:pPr>
+              <w:spacing w:after="0" w:line="288" w:lineRule="auto"/>
+              <w:jc w:val="left"/>
+            </w:pPr>
+            <w:r/>
+            <w:r>
+              <w:rPr>
+                <w:rFonts w:ascii="Microsoft YaHei" w:hAnsi="Microsoft YaHei" w:eastAsia="Microsoft YaHei"/>
+                <w:b w:val="0"/>
+                <w:color w:val="253C37"/>
+                <w:sz w:val="18"/>
+              </w:rPr>
+              <w:t>忽略旧请求的迟到响应，只呈现最新查询结果</w:t>
+            </w:r>
+          </w:p>
+        </w:tc>
+      </w:tr>
     </w:tbl>
     <w:p>
       <w:pPr>
@@ -7508,7 +8359,7 @@
         <w:pStyle w:val="Heading1"/>
       </w:pPr>
       <w:r>
-        <w:t>11 非功能要求</w:t>
+        <w:t>12 非功能要求</w:t>
       </w:r>
     </w:p>
     <w:tbl>
@@ -7898,7 +8749,7 @@
                 <w:color w:val="253C37"/>
                 <w:sz w:val="18"/>
               </w:rPr>
-              <w:t>记忆接口游标分页；首页前端自动拉取分页；批量导入顺序执行</w:t>
+              <w:t>记忆寻迹固定每页五条并使用稳定游标；标题备忘录和状态字段具备 PostgreSQL 搜索索引</w:t>
             </w:r>
           </w:p>
         </w:tc>
@@ -8043,7 +8894,7 @@
         <w:pStyle w:val="Heading1"/>
       </w:pPr>
       <w:r>
-        <w:t>12 验收标准与预期效果</w:t>
+        <w:t>13 验收标准与预期效果</w:t>
       </w:r>
     </w:p>
     <w:tbl>
@@ -8972,6 +9823,98 @@
           </w:p>
         </w:tc>
       </w:tr>
+      <w:tr>
+        <w:trPr>
+          <w:cantSplit/>
+        </w:trPr>
+        <w:tc>
+          <w:tcPr>
+            <w:tcW w:type="dxa" w:w="1007"/>
+            <w:shd w:fill="EEF5F2"/>
+            <w:vAlign w:val="center"/>
+            <w:tcMar>
+              <w:top w:w="110" w:type="dxa"/>
+              <w:start w:w="120" w:type="dxa"/>
+              <w:bottom w:w="110" w:type="dxa"/>
+              <w:end w:w="120" w:type="dxa"/>
+            </w:tcMar>
+          </w:tcPr>
+          <w:p>
+            <w:pPr>
+              <w:spacing w:after="0" w:line="288" w:lineRule="auto"/>
+              <w:jc w:val="center"/>
+            </w:pPr>
+            <w:r/>
+            <w:r>
+              <w:rPr>
+                <w:rFonts w:ascii="Microsoft YaHei" w:hAnsi="Microsoft YaHei" w:eastAsia="Microsoft YaHei"/>
+                <w:b w:val="0"/>
+                <w:color w:val="253C37"/>
+                <w:sz w:val="18"/>
+              </w:rPr>
+              <w:t>A10</w:t>
+            </w:r>
+          </w:p>
+        </w:tc>
+        <w:tc>
+          <w:tcPr>
+            <w:tcW w:type="dxa" w:w="6696"/>
+            <w:shd w:fill="EEF5F2"/>
+            <w:vAlign w:val="center"/>
+            <w:tcMar>
+              <w:top w:w="110" w:type="dxa"/>
+              <w:start w:w="120" w:type="dxa"/>
+              <w:bottom w:w="110" w:type="dxa"/>
+              <w:end w:w="120" w:type="dxa"/>
+            </w:tcMar>
+          </w:tcPr>
+          <w:p>
+            <w:pPr>
+              <w:spacing w:after="0" w:line="288" w:lineRule="auto"/>
+              <w:jc w:val="left"/>
+            </w:pPr>
+            <w:r/>
+            <w:r>
+              <w:rPr>
+                <w:rFonts w:ascii="Microsoft YaHei" w:hAnsi="Microsoft YaHei" w:eastAsia="Microsoft YaHei"/>
+                <w:b w:val="0"/>
+                <w:color w:val="253C37"/>
+                <w:sz w:val="18"/>
+              </w:rPr>
+              <w:t>记忆寻迹支持条件确认、AND 查询、稳定分页、最近二十条、放宽建议及详情编辑删除回流</w:t>
+            </w:r>
+          </w:p>
+        </w:tc>
+        <w:tc>
+          <w:tcPr>
+            <w:tcW w:type="dxa" w:w="2304"/>
+            <w:shd w:fill="EEF5F2"/>
+            <w:vAlign w:val="center"/>
+            <w:tcMar>
+              <w:top w:w="110" w:type="dxa"/>
+              <w:start w:w="120" w:type="dxa"/>
+              <w:bottom w:w="110" w:type="dxa"/>
+              <w:end w:w="120" w:type="dxa"/>
+            </w:tcMar>
+          </w:tcPr>
+          <w:p>
+            <w:pPr>
+              <w:spacing w:after="0" w:line="288" w:lineRule="auto"/>
+              <w:jc w:val="left"/>
+            </w:pPr>
+            <w:r/>
+            <w:r>
+              <w:rPr>
+                <w:rFonts w:ascii="Microsoft YaHei" w:hAnsi="Microsoft YaHei" w:eastAsia="Microsoft YaHei"/>
+                <w:b w:val="0"/>
+                <w:color w:val="253C37"/>
+                <w:sz w:val="18"/>
+              </w:rPr>
+              <w:t>已实现并自动测试</w:t>
+            </w:r>
+          </w:p>
+        </w:tc>
+      </w:tr>
     </w:tbl>
     <w:p>
       <w:pPr>
@@ -8980,7 +9923,12 @@
     </w:p>
     <w:p>
       <w:r>
-        <w:t>本次发布前验证基线为前端 38 个测试文件共 100 项通过，后端 33 个测试文件共 136 项通过；前后端生产构建通过，Prisma schema 有效，6 个数据库迁移全部应用。最终交付前会再次执行全量验证。</w:t>
+        <w:t>本次发布前验证基线为前端 47 个测试文件共 161 项通过，后端 37 个测试文件共 163 项通过；前后端生产构建通过，Prisma schema 有效，7 个数据库迁移全部应用。10,000 条事务内临时数据实测后已回滚。最终交付前会再次执行全量验证。</w:t>
+      </w:r>
+    </w:p>
+    <w:p>
+      <w:r>
+        <w:br w:type="page"/>
       </w:r>
     </w:p>
     <w:p>
@@ -8988,7 +9936,7 @@
         <w:pStyle w:val="Heading1"/>
       </w:pPr>
       <w:r>
-        <w:t>13 版本边界与后续规划</w:t>
+        <w:t>14 版本边界与后续规划</w:t>
       </w:r>
     </w:p>
     <w:p>
@@ -9028,15 +9976,7 @@
         <w:pStyle w:val="ListBullet"/>
       </w:pPr>
       <w:r>
-        <w:t>下一优先级是把重要日子和自定义候选列表迁移到 PostgreSQL，并纳入统一导出。</w:t>
-      </w:r>
-    </w:p>
-    <w:p>
-      <w:pPr>
-        <w:pStyle w:val="ListBullet"/>
-      </w:pPr>
-      <w:r>
-        <w:t>后续可增加应用启动时的自动备份策略、备份保留周期和恢复演练提醒。</w:t>
+        <w:t>下一优先级是把重要日子和自定义候选列表迁移到 PostgreSQL 并纳入统一导出，同时增加自动备份策略、保留周期和恢复演练提醒。</w:t>
       </w:r>
     </w:p>
     <w:sectPr>

</xml_diff>